<commit_message>
Remove separate osaka.html and willy.html interview pages
Deleted standalone interview articles for 문윤정 and 윌리, and removed their corresponding boarding pass tickets from index.html.

Co-Authored-By: Claude Sonnet 4.6 <noreply@anthropic.com>
</commit_message>
<xml_diff>
--- a/워홀 기사.docx
+++ b/워홀 기사.docx
@@ -133,7 +133,7 @@
           <w:color w:val="000000"/>
           <w:szCs w:val="22"/>
         </w:rPr>
-        <w:t>“한국에선 일자리도 알바도 못 구해요”… ‘워홀’ 떠난 청년, 2년 새 두 배.</w:t>
+        <w:t>“한국에선 일자리도 알바도 못 구해요”… ‘워홀’ 떠난 청년, 2년새 두 배.</w:t>
       </w:r>
       <w:r>
         <w:rPr>
@@ -147,7 +147,7 @@
     <w:p>
       <w:pPr>
         <w:rPr>
-          <w:rFonts w:eastAsiaTheme="minorHAnsi" w:hint="eastAsia"/>
+          <w:rFonts w:eastAsiaTheme="minorHAnsi"/>
           <w:color w:val="000000"/>
           <w:szCs w:val="22"/>
         </w:rPr>
@@ -160,6 +160,14 @@
         </w:rPr>
         <w:t xml:space="preserve">최근 </w:t>
       </w:r>
+      <w:r>
+        <w:rPr>
+          <w:rFonts w:eastAsiaTheme="minorHAnsi" w:hint="eastAsia"/>
+          <w:color w:val="000000"/>
+          <w:szCs w:val="22"/>
+        </w:rPr>
+        <w:t xml:space="preserve">일간지에 난 </w:t>
+      </w:r>
       <w:proofErr w:type="spellStart"/>
       <w:r>
         <w:rPr>
@@ -226,29 +234,181 @@
         </w:rPr>
         <w:t xml:space="preserve"> </w:t>
       </w:r>
-      <w:r>
-        <w:rPr>
-          <w:rFonts w:eastAsiaTheme="minorHAnsi"/>
-          <w:color w:val="000000"/>
-          <w:szCs w:val="22"/>
-        </w:rPr>
-        <w:t xml:space="preserve">워홀을 떠나는 청년들이 </w:t>
-      </w:r>
-      <w:r>
-        <w:rPr>
-          <w:rFonts w:eastAsiaTheme="minorHAnsi" w:hint="eastAsia"/>
-          <w:color w:val="000000"/>
-          <w:szCs w:val="22"/>
-        </w:rPr>
-        <w:t>증가하면서</w:t>
-      </w:r>
-      <w:r>
-        <w:rPr>
-          <w:rFonts w:eastAsiaTheme="minorHAnsi"/>
-          <w:color w:val="000000"/>
-          <w:szCs w:val="22"/>
-        </w:rPr>
-        <w:t>,</w:t>
+      <w:proofErr w:type="spellStart"/>
+      <w:r>
+        <w:rPr>
+          <w:rFonts w:eastAsiaTheme="minorHAnsi" w:hint="eastAsia"/>
+          <w:color w:val="000000"/>
+          <w:szCs w:val="22"/>
+        </w:rPr>
+        <w:t>워킹홀리데이는</w:t>
+      </w:r>
+      <w:proofErr w:type="spellEnd"/>
+      <w:r>
+        <w:rPr>
+          <w:rFonts w:eastAsiaTheme="minorHAnsi" w:hint="eastAsia"/>
+          <w:color w:val="000000"/>
+          <w:szCs w:val="22"/>
+        </w:rPr>
+        <w:t xml:space="preserve"> </w:t>
+      </w:r>
+      <w:r>
+        <w:rPr>
+          <w:rFonts w:eastAsiaTheme="minorHAnsi"/>
+          <w:szCs w:val="22"/>
+        </w:rPr>
+        <w:t>청년</w:t>
+      </w:r>
+      <w:r>
+        <w:rPr>
+          <w:rFonts w:eastAsiaTheme="minorHAnsi" w:hint="eastAsia"/>
+          <w:szCs w:val="22"/>
+        </w:rPr>
+        <w:t xml:space="preserve">(대체로 </w:t>
+      </w:r>
+      <w:r>
+        <w:rPr>
+          <w:rFonts w:eastAsiaTheme="minorHAnsi"/>
+          <w:szCs w:val="22"/>
+        </w:rPr>
+        <w:t>만 18~30세</w:t>
+      </w:r>
+      <w:r>
+        <w:rPr>
+          <w:rFonts w:eastAsiaTheme="minorHAnsi"/>
+          <w:szCs w:val="22"/>
+        </w:rPr>
+        <w:t>)</w:t>
+      </w:r>
+      <w:r>
+        <w:rPr>
+          <w:rFonts w:eastAsiaTheme="minorHAnsi" w:hint="eastAsia"/>
+          <w:szCs w:val="22"/>
+        </w:rPr>
+        <w:t>들</w:t>
+      </w:r>
+      <w:r>
+        <w:rPr>
+          <w:rFonts w:eastAsiaTheme="minorHAnsi"/>
+          <w:szCs w:val="22"/>
+        </w:rPr>
+        <w:t xml:space="preserve">이 협정 체결 국가에서 </w:t>
+      </w:r>
+      <w:r>
+        <w:rPr>
+          <w:rFonts w:eastAsiaTheme="minorHAnsi" w:hint="eastAsia"/>
+          <w:szCs w:val="22"/>
+        </w:rPr>
+        <w:t xml:space="preserve">최대 </w:t>
+      </w:r>
+      <w:r>
+        <w:rPr>
+          <w:rFonts w:eastAsiaTheme="minorHAnsi"/>
+          <w:szCs w:val="22"/>
+        </w:rPr>
+        <w:t>1</w:t>
+      </w:r>
+      <w:r>
+        <w:rPr>
+          <w:rFonts w:eastAsiaTheme="minorHAnsi" w:hint="eastAsia"/>
+          <w:szCs w:val="22"/>
+        </w:rPr>
+        <w:t xml:space="preserve">년 동안 </w:t>
+      </w:r>
+      <w:r>
+        <w:rPr>
+          <w:rFonts w:eastAsiaTheme="minorHAnsi"/>
+          <w:szCs w:val="22"/>
+        </w:rPr>
+        <w:t>관광, 취업, 어학연수 등을 병행할 수 있도록 마련된 제도</w:t>
+      </w:r>
+      <w:r>
+        <w:rPr>
+          <w:rFonts w:eastAsiaTheme="minorHAnsi" w:hint="eastAsia"/>
+          <w:color w:val="000000"/>
+          <w:szCs w:val="22"/>
+        </w:rPr>
+        <w:t>다.</w:t>
+      </w:r>
+      <w:r>
+        <w:rPr>
+          <w:rFonts w:eastAsiaTheme="minorHAnsi"/>
+          <w:color w:val="000000"/>
+          <w:szCs w:val="22"/>
+        </w:rPr>
+        <w:t xml:space="preserve"> </w:t>
+      </w:r>
+      <w:r>
+        <w:rPr>
+          <w:rFonts w:eastAsiaTheme="minorHAnsi" w:hint="eastAsia"/>
+          <w:color w:val="000000"/>
+          <w:szCs w:val="22"/>
+        </w:rPr>
+        <w:t>최근 워홀을 떠나는 청년들이</w:t>
+      </w:r>
+      <w:r>
+        <w:rPr>
+          <w:rFonts w:eastAsiaTheme="minorHAnsi" w:hint="eastAsia"/>
+          <w:color w:val="000000"/>
+          <w:szCs w:val="22"/>
+        </w:rPr>
+        <w:t xml:space="preserve"> </w:t>
+      </w:r>
+      <w:r>
+        <w:rPr>
+          <w:rFonts w:eastAsiaTheme="minorHAnsi"/>
+          <w:color w:val="000000"/>
+          <w:szCs w:val="22"/>
+        </w:rPr>
+        <w:t>2</w:t>
+      </w:r>
+      <w:r>
+        <w:rPr>
+          <w:rFonts w:eastAsiaTheme="minorHAnsi" w:hint="eastAsia"/>
+          <w:color w:val="000000"/>
+          <w:szCs w:val="22"/>
+        </w:rPr>
+        <w:t>년</w:t>
+      </w:r>
+      <w:r>
+        <w:rPr>
+          <w:rFonts w:eastAsiaTheme="minorHAnsi" w:hint="eastAsia"/>
+          <w:color w:val="000000"/>
+          <w:szCs w:val="22"/>
+        </w:rPr>
+        <w:t xml:space="preserve"> </w:t>
+      </w:r>
+      <w:r>
+        <w:rPr>
+          <w:rFonts w:eastAsiaTheme="minorHAnsi" w:hint="eastAsia"/>
+          <w:color w:val="000000"/>
+          <w:szCs w:val="22"/>
+        </w:rPr>
+        <w:t>새</w:t>
+      </w:r>
+      <w:r>
+        <w:rPr>
+          <w:rFonts w:eastAsiaTheme="minorHAnsi" w:hint="eastAsia"/>
+          <w:color w:val="000000"/>
+          <w:szCs w:val="22"/>
+        </w:rPr>
+        <w:t xml:space="preserve"> 두</w:t>
+      </w:r>
+      <w:r>
+        <w:rPr>
+          <w:rFonts w:eastAsiaTheme="minorHAnsi" w:hint="eastAsia"/>
+          <w:color w:val="000000"/>
+          <w:szCs w:val="22"/>
+        </w:rPr>
+        <w:t xml:space="preserve"> </w:t>
+      </w:r>
+      <w:r>
+        <w:rPr>
+          <w:rFonts w:eastAsiaTheme="minorHAnsi" w:hint="eastAsia"/>
+          <w:color w:val="000000"/>
+          <w:szCs w:val="22"/>
+        </w:rPr>
+        <w:t>배 가까이 늘면서,</w:t>
       </w:r>
       <w:r>
         <w:rPr>
@@ -273,6 +433,14 @@
           <w:szCs w:val="22"/>
         </w:rPr>
         <w:t>’</w:t>
+      </w:r>
+      <w:r>
+        <w:rPr>
+          <w:rFonts w:eastAsiaTheme="minorHAnsi" w:hint="eastAsia"/>
+          <w:color w:val="000000"/>
+          <w:szCs w:val="22"/>
+        </w:rPr>
+        <w:t>라</w:t>
       </w:r>
       <w:r>
         <w:rPr>
@@ -311,30 +479,41 @@
       </w:pPr>
       <w:r>
         <w:rPr>
+          <w:rFonts w:asciiTheme="minorHAnsi" w:eastAsiaTheme="minorHAnsi" w:hAnsiTheme="minorHAnsi" w:hint="eastAsia"/>
+          <w:color w:val="000000"/>
+          <w:sz w:val="22"/>
+          <w:szCs w:val="22"/>
+        </w:rPr>
+        <w:t xml:space="preserve">한편에는 </w:t>
+      </w:r>
+      <w:proofErr w:type="spellStart"/>
+      <w:r>
+        <w:rPr>
+          <w:rFonts w:asciiTheme="minorHAnsi" w:eastAsiaTheme="minorHAnsi" w:hAnsiTheme="minorHAnsi" w:hint="eastAsia"/>
+          <w:color w:val="000000"/>
+          <w:sz w:val="22"/>
+          <w:szCs w:val="22"/>
+        </w:rPr>
+        <w:t>그들에</w:t>
+      </w:r>
+      <w:proofErr w:type="spellEnd"/>
+      <w:r>
+        <w:rPr>
+          <w:rFonts w:asciiTheme="minorHAnsi" w:eastAsiaTheme="minorHAnsi" w:hAnsiTheme="minorHAnsi" w:hint="eastAsia"/>
+          <w:color w:val="000000"/>
+          <w:sz w:val="22"/>
+          <w:szCs w:val="22"/>
+        </w:rPr>
+        <w:t xml:space="preserve"> 대한 </w:t>
+      </w:r>
+      <w:r>
+        <w:rPr>
           <w:rFonts w:asciiTheme="minorHAnsi" w:eastAsiaTheme="minorHAnsi" w:hAnsiTheme="minorHAnsi"/>
           <w:color w:val="000000"/>
           <w:sz w:val="22"/>
           <w:szCs w:val="22"/>
         </w:rPr>
-        <w:t xml:space="preserve">취업난이 청년들을 해외로 내몬다는 </w:t>
-      </w:r>
-      <w:r>
-        <w:rPr>
-          <w:rFonts w:asciiTheme="minorHAnsi" w:eastAsiaTheme="minorHAnsi" w:hAnsiTheme="minorHAnsi" w:hint="eastAsia"/>
-          <w:color w:val="000000"/>
-          <w:sz w:val="22"/>
-          <w:szCs w:val="22"/>
-        </w:rPr>
-        <w:t>생각</w:t>
-      </w:r>
-      <w:r>
-        <w:rPr>
-          <w:rFonts w:asciiTheme="minorHAnsi" w:eastAsiaTheme="minorHAnsi" w:hAnsiTheme="minorHAnsi"/>
-          <w:color w:val="000000"/>
-          <w:sz w:val="22"/>
-          <w:szCs w:val="22"/>
-        </w:rPr>
-        <w:t xml:space="preserve"> 뒤에는 냉소적인 시선도 존재한다. 스펙 경쟁에서 도망쳐 그저 놀러 가려는 게 아니냐는 의심이다. 실제로 초기 정착 비용만 </w:t>
+        <w:t xml:space="preserve">냉소적인 시선도 존재한다. 스펙 경쟁에서 도망쳐 그저 놀러 가려는 게 아니냐는 의심. 실제로 초기 정착 비용만 </w:t>
       </w:r>
       <w:proofErr w:type="spellStart"/>
       <w:r>
@@ -387,34 +566,98 @@
       </w:pPr>
       <w:r>
         <w:rPr>
+          <w:rFonts w:asciiTheme="minorHAnsi" w:eastAsiaTheme="minorHAnsi" w:hAnsiTheme="minorHAnsi" w:hint="eastAsia"/>
+          <w:color w:val="000000"/>
+          <w:sz w:val="22"/>
+          <w:szCs w:val="22"/>
+        </w:rPr>
+        <w:t>그렇다면 청년들이 워홀을 선택하는 이유는 무엇일까.</w:t>
+      </w:r>
+      <w:r>
+        <w:rPr>
           <w:rFonts w:asciiTheme="minorHAnsi" w:eastAsiaTheme="minorHAnsi" w:hAnsiTheme="minorHAnsi"/>
           <w:color w:val="000000"/>
           <w:sz w:val="22"/>
           <w:szCs w:val="22"/>
         </w:rPr>
-        <w:t>하지만 이런 의견 속에서도 청년들이 짐을 싸는 데는</w:t>
-      </w:r>
-      <w:r>
-        <w:rPr>
-          <w:rStyle w:val="apple-converted-space"/>
+        <w:t xml:space="preserve"> </w:t>
+      </w:r>
+      <w:r>
+        <w:rPr>
+          <w:rFonts w:asciiTheme="minorHAnsi" w:eastAsiaTheme="minorHAnsi" w:hAnsiTheme="minorHAnsi" w:hint="eastAsia"/>
+          <w:color w:val="000000"/>
+          <w:sz w:val="22"/>
+          <w:szCs w:val="22"/>
+        </w:rPr>
+        <w:t xml:space="preserve">그들의 말을 </w:t>
+      </w:r>
+      <w:proofErr w:type="spellStart"/>
+      <w:r>
+        <w:rPr>
+          <w:rFonts w:asciiTheme="minorHAnsi" w:eastAsiaTheme="minorHAnsi" w:hAnsiTheme="minorHAnsi" w:hint="eastAsia"/>
+          <w:color w:val="000000"/>
+          <w:sz w:val="22"/>
+          <w:szCs w:val="22"/>
+        </w:rPr>
+        <w:t>들어보기</w:t>
+      </w:r>
+      <w:proofErr w:type="spellEnd"/>
+      <w:r>
+        <w:rPr>
+          <w:rFonts w:asciiTheme="minorHAnsi" w:eastAsiaTheme="minorHAnsi" w:hAnsiTheme="minorHAnsi" w:hint="eastAsia"/>
+          <w:color w:val="000000"/>
+          <w:sz w:val="22"/>
+          <w:szCs w:val="22"/>
+        </w:rPr>
+        <w:t xml:space="preserve"> 위해 </w:t>
+      </w:r>
+      <w:r>
+        <w:rPr>
           <w:rFonts w:asciiTheme="minorHAnsi" w:eastAsiaTheme="minorHAnsi" w:hAnsiTheme="minorHAnsi"/>
           <w:color w:val="000000"/>
           <w:sz w:val="22"/>
           <w:szCs w:val="22"/>
         </w:rPr>
-        <w:t> </w:t>
+        <w:t>‘</w:t>
       </w:r>
       <w:proofErr w:type="spellStart"/>
       <w:r>
         <w:rPr>
+          <w:rFonts w:asciiTheme="minorHAnsi" w:eastAsiaTheme="minorHAnsi" w:hAnsiTheme="minorHAnsi" w:hint="eastAsia"/>
+          <w:color w:val="000000"/>
+          <w:sz w:val="22"/>
+          <w:szCs w:val="22"/>
+        </w:rPr>
+        <w:t>워킹홀리데이</w:t>
+      </w:r>
+      <w:proofErr w:type="spellEnd"/>
+      <w:r>
+        <w:rPr>
+          <w:rFonts w:asciiTheme="minorHAnsi" w:eastAsiaTheme="minorHAnsi" w:hAnsiTheme="minorHAnsi" w:hint="eastAsia"/>
+          <w:color w:val="000000"/>
+          <w:sz w:val="22"/>
+          <w:szCs w:val="22"/>
+        </w:rPr>
+        <w:t xml:space="preserve"> 카페</w:t>
+      </w:r>
+      <w:r>
+        <w:rPr>
           <w:rFonts w:asciiTheme="minorHAnsi" w:eastAsiaTheme="minorHAnsi" w:hAnsiTheme="minorHAnsi"/>
           <w:color w:val="000000"/>
           <w:sz w:val="22"/>
           <w:szCs w:val="22"/>
         </w:rPr>
-        <w:t>그들만의</w:t>
-      </w:r>
-      <w:proofErr w:type="spellEnd"/>
+        <w:t>’</w:t>
+      </w:r>
+      <w:r>
+        <w:rPr>
+          <w:rFonts w:asciiTheme="minorHAnsi" w:eastAsiaTheme="minorHAnsi" w:hAnsiTheme="minorHAnsi" w:hint="eastAsia"/>
+          <w:color w:val="000000"/>
+          <w:sz w:val="22"/>
+          <w:szCs w:val="22"/>
+        </w:rPr>
+        <w:t xml:space="preserve">와 </w:t>
+      </w:r>
       <w:r>
         <w:rPr>
           <w:rFonts w:asciiTheme="minorHAnsi" w:eastAsiaTheme="minorHAnsi" w:hAnsiTheme="minorHAnsi"/>
@@ -422,17 +665,34 @@
           <w:sz w:val="22"/>
           <w:szCs w:val="22"/>
         </w:rPr>
-        <w:t xml:space="preserve"> 분명한 이유가 있었다.</w:t>
-      </w:r>
-      <w:r>
-        <w:rPr>
-          <w:rStyle w:val="apple-converted-space"/>
+        <w:t>‘</w:t>
+      </w:r>
+      <w:r>
+        <w:rPr>
+          <w:rFonts w:asciiTheme="minorHAnsi" w:eastAsiaTheme="minorHAnsi" w:hAnsiTheme="minorHAnsi" w:hint="eastAsia"/>
+          <w:color w:val="000000"/>
+          <w:sz w:val="22"/>
+          <w:szCs w:val="22"/>
+        </w:rPr>
+        <w:t>바나나 워홀 카페</w:t>
+      </w:r>
+      <w:r>
+        <w:rPr>
           <w:rFonts w:asciiTheme="minorHAnsi" w:eastAsiaTheme="minorHAnsi" w:hAnsiTheme="minorHAnsi"/>
           <w:color w:val="000000"/>
           <w:sz w:val="22"/>
           <w:szCs w:val="22"/>
         </w:rPr>
-        <w:t> </w:t>
+        <w:t xml:space="preserve">’ </w:t>
+      </w:r>
+      <w:r>
+        <w:rPr>
+          <w:rFonts w:asciiTheme="minorHAnsi" w:eastAsiaTheme="minorHAnsi" w:hAnsiTheme="minorHAnsi" w:hint="eastAsia"/>
+          <w:color w:val="000000"/>
+          <w:sz w:val="22"/>
+          <w:szCs w:val="22"/>
+        </w:rPr>
+        <w:t>두 곳에 설문</w:t>
       </w:r>
       <w:r>
         <w:rPr>
@@ -441,17 +701,34 @@
           <w:sz w:val="22"/>
           <w:szCs w:val="22"/>
         </w:rPr>
-        <w:t>현실 도피나 단순한 유흥이 아닌,</w:t>
-      </w:r>
-      <w:r>
-        <w:rPr>
-          <w:rStyle w:val="apple-converted-space"/>
+        <w:t xml:space="preserve"> </w:t>
+      </w:r>
+      <w:r>
+        <w:rPr>
+          <w:rFonts w:asciiTheme="minorHAnsi" w:eastAsiaTheme="minorHAnsi" w:hAnsiTheme="minorHAnsi" w:hint="eastAsia"/>
+          <w:color w:val="000000"/>
+          <w:sz w:val="22"/>
+          <w:szCs w:val="22"/>
+        </w:rPr>
+        <w:t>조사를</w:t>
+      </w:r>
+      <w:r>
+        <w:rPr>
           <w:rFonts w:asciiTheme="minorHAnsi" w:eastAsiaTheme="minorHAnsi" w:hAnsiTheme="minorHAnsi"/>
           <w:color w:val="000000"/>
           <w:sz w:val="22"/>
           <w:szCs w:val="22"/>
         </w:rPr>
-        <w:t> </w:t>
+        <w:t xml:space="preserve"> </w:t>
+      </w:r>
+      <w:r>
+        <w:rPr>
+          <w:rFonts w:asciiTheme="minorHAnsi" w:eastAsiaTheme="minorHAnsi" w:hAnsiTheme="minorHAnsi" w:hint="eastAsia"/>
+          <w:color w:val="000000"/>
+          <w:sz w:val="22"/>
+          <w:szCs w:val="22"/>
+        </w:rPr>
+        <w:t>했다.</w:t>
       </w:r>
       <w:r>
         <w:rPr>
@@ -460,7 +737,7 @@
           <w:sz w:val="22"/>
           <w:szCs w:val="22"/>
         </w:rPr>
-        <w:t>그들</w:t>
+        <w:t xml:space="preserve"> </w:t>
       </w:r>
       <w:r>
         <w:rPr>
@@ -469,7 +746,7 @@
           <w:sz w:val="22"/>
           <w:szCs w:val="22"/>
         </w:rPr>
-        <w:t>의</w:t>
+        <w:t>조사에는 워홀 준비 중인 사람,</w:t>
       </w:r>
       <w:r>
         <w:rPr>
@@ -478,7 +755,16 @@
           <w:sz w:val="22"/>
           <w:szCs w:val="22"/>
         </w:rPr>
-        <w:t xml:space="preserve"> 진짜 목적을 확인하기</w:t>
+        <w:t xml:space="preserve"> </w:t>
+      </w:r>
+      <w:r>
+        <w:rPr>
+          <w:rFonts w:asciiTheme="minorHAnsi" w:eastAsiaTheme="minorHAnsi" w:hAnsiTheme="minorHAnsi" w:hint="eastAsia"/>
+          <w:color w:val="000000"/>
+          <w:sz w:val="22"/>
+          <w:szCs w:val="22"/>
+        </w:rPr>
+        <w:t>현재 체류 중인 사람,</w:t>
       </w:r>
       <w:r>
         <w:rPr>
@@ -491,34 +777,67 @@
       </w:r>
       <w:r>
         <w:rPr>
+          <w:rFonts w:asciiTheme="minorHAnsi" w:eastAsiaTheme="minorHAnsi" w:hAnsiTheme="minorHAnsi" w:hint="eastAsia"/>
+          <w:color w:val="000000"/>
+          <w:sz w:val="22"/>
+          <w:szCs w:val="22"/>
+        </w:rPr>
+        <w:t xml:space="preserve">이미 귀국한 사람 총 </w:t>
+      </w:r>
+      <w:r>
+        <w:rPr>
           <w:rFonts w:asciiTheme="minorHAnsi" w:eastAsiaTheme="minorHAnsi" w:hAnsiTheme="minorHAnsi"/>
           <w:color w:val="000000"/>
           <w:sz w:val="22"/>
           <w:szCs w:val="22"/>
         </w:rPr>
-        <w:t>위해</w:t>
-      </w:r>
-      <w:r>
-        <w:rPr>
-          <w:rStyle w:val="apple-converted-space"/>
+        <w:t>18</w:t>
+      </w:r>
+      <w:r>
+        <w:rPr>
+          <w:rFonts w:asciiTheme="minorHAnsi" w:eastAsiaTheme="minorHAnsi" w:hAnsiTheme="minorHAnsi" w:hint="eastAsia"/>
+          <w:color w:val="000000"/>
+          <w:sz w:val="22"/>
+          <w:szCs w:val="22"/>
+        </w:rPr>
+        <w:t>명이 참여했다.</w:t>
+      </w:r>
+      <w:r>
+        <w:rPr>
           <w:rFonts w:asciiTheme="minorHAnsi" w:eastAsiaTheme="minorHAnsi" w:hAnsiTheme="minorHAnsi"/>
           <w:color w:val="000000"/>
           <w:sz w:val="22"/>
           <w:szCs w:val="22"/>
         </w:rPr>
-        <w:t> </w:t>
-      </w:r>
-      <w:r>
-        <w:rPr>
-          <w:rStyle w:val="apple-converted-space"/>
+        <w:t xml:space="preserve"> </w:t>
+      </w:r>
+      <w:r>
+        <w:rPr>
+          <w:rFonts w:asciiTheme="minorHAnsi" w:eastAsiaTheme="minorHAnsi" w:hAnsiTheme="minorHAnsi" w:hint="eastAsia"/>
+          <w:color w:val="000000"/>
+          <w:sz w:val="22"/>
+          <w:szCs w:val="22"/>
+        </w:rPr>
+        <w:t>추가로</w:t>
+      </w:r>
+      <w:r>
+        <w:rPr>
           <w:rFonts w:asciiTheme="minorHAnsi" w:eastAsiaTheme="minorHAnsi" w:hAnsiTheme="minorHAnsi"/>
           <w:color w:val="000000"/>
           <w:sz w:val="22"/>
           <w:szCs w:val="22"/>
         </w:rPr>
-        <w:t>‘</w:t>
-      </w:r>
-      <w:proofErr w:type="spellStart"/>
+        <w:t xml:space="preserve"> </w:t>
+      </w:r>
+      <w:r>
+        <w:rPr>
+          <w:rFonts w:asciiTheme="minorHAnsi" w:eastAsiaTheme="minorHAnsi" w:hAnsiTheme="minorHAnsi" w:hint="eastAsia"/>
+          <w:color w:val="000000"/>
+          <w:sz w:val="22"/>
+          <w:szCs w:val="22"/>
+        </w:rPr>
+        <w:t>설문 참여자 중</w:t>
+      </w:r>
       <w:r>
         <w:rPr>
           <w:rFonts w:asciiTheme="minorHAnsi" w:eastAsiaTheme="minorHAnsi" w:hAnsiTheme="minorHAnsi"/>
@@ -526,187 +845,40 @@
           <w:sz w:val="22"/>
           <w:szCs w:val="22"/>
         </w:rPr>
-        <w:t>워킹홀리데이</w:t>
-      </w:r>
-      <w:proofErr w:type="spellEnd"/>
-      <w:r>
-        <w:rPr>
-          <w:rFonts w:asciiTheme="minorHAnsi" w:eastAsiaTheme="minorHAnsi" w:hAnsiTheme="minorHAnsi"/>
+        <w:t xml:space="preserve"> </w:t>
+      </w:r>
+      <w:r>
+        <w:rPr>
+          <w:rFonts w:asciiTheme="minorHAnsi" w:eastAsiaTheme="minorHAnsi" w:hAnsiTheme="minorHAnsi" w:hint="eastAsia"/>
           <w:color w:val="000000"/>
           <w:sz w:val="22"/>
           <w:szCs w:val="22"/>
         </w:rPr>
-        <w:t xml:space="preserve"> 카페</w:t>
-      </w:r>
-      <w:r>
-        <w:rPr>
-          <w:rFonts w:asciiTheme="minorHAnsi" w:eastAsiaTheme="minorHAnsi" w:hAnsiTheme="minorHAnsi"/>
+        <w:t>3명</w:t>
+      </w:r>
+      <w:r>
+        <w:rPr>
+          <w:rFonts w:asciiTheme="minorHAnsi" w:eastAsiaTheme="minorHAnsi" w:hAnsiTheme="minorHAnsi" w:hint="eastAsia"/>
           <w:color w:val="000000"/>
           <w:sz w:val="22"/>
           <w:szCs w:val="22"/>
         </w:rPr>
-        <w:t>’</w:t>
-      </w:r>
-      <w:r>
-        <w:rPr>
-          <w:rFonts w:asciiTheme="minorHAnsi" w:eastAsiaTheme="minorHAnsi" w:hAnsiTheme="minorHAnsi"/>
+        <w:t>과</w:t>
+      </w:r>
+      <w:r>
+        <w:rPr>
+          <w:rFonts w:asciiTheme="minorHAnsi" w:eastAsiaTheme="minorHAnsi" w:hAnsiTheme="minorHAnsi" w:hint="eastAsia"/>
           <w:color w:val="000000"/>
           <w:sz w:val="22"/>
           <w:szCs w:val="22"/>
         </w:rPr>
-        <w:t xml:space="preserve">와 </w:t>
-      </w:r>
-      <w:proofErr w:type="spellStart"/>
-      <w:r>
-        <w:rPr>
-          <w:rFonts w:asciiTheme="minorHAnsi" w:eastAsiaTheme="minorHAnsi" w:hAnsiTheme="minorHAnsi"/>
-          <w:color w:val="000000"/>
-          <w:sz w:val="22"/>
-          <w:szCs w:val="22"/>
-        </w:rPr>
-        <w:t>‘</w:t>
-      </w:r>
-      <w:proofErr w:type="spellEnd"/>
-      <w:r>
-        <w:rPr>
-          <w:rFonts w:asciiTheme="minorHAnsi" w:eastAsiaTheme="minorHAnsi" w:hAnsiTheme="minorHAnsi"/>
-          <w:color w:val="000000"/>
-          <w:sz w:val="22"/>
-          <w:szCs w:val="22"/>
-        </w:rPr>
-        <w:t>바나나 워홀</w:t>
-      </w:r>
-      <w:r>
-        <w:rPr>
-          <w:rFonts w:asciiTheme="minorHAnsi" w:eastAsiaTheme="minorHAnsi" w:hAnsiTheme="minorHAnsi"/>
-          <w:color w:val="000000"/>
-          <w:sz w:val="22"/>
-          <w:szCs w:val="22"/>
-        </w:rPr>
-        <w:t xml:space="preserve"> </w:t>
-      </w:r>
-      <w:r>
-        <w:rPr>
-          <w:rFonts w:asciiTheme="minorHAnsi" w:eastAsiaTheme="minorHAnsi" w:hAnsiTheme="minorHAnsi"/>
-          <w:color w:val="000000"/>
-          <w:sz w:val="22"/>
-          <w:szCs w:val="22"/>
-        </w:rPr>
-        <w:t>카페</w:t>
-      </w:r>
-      <w:r>
-        <w:rPr>
-          <w:rFonts w:asciiTheme="minorHAnsi" w:eastAsiaTheme="minorHAnsi" w:hAnsiTheme="minorHAnsi"/>
-          <w:color w:val="000000"/>
-          <w:sz w:val="22"/>
-          <w:szCs w:val="22"/>
-        </w:rPr>
-        <w:t>’</w:t>
-      </w:r>
-      <w:r>
-        <w:rPr>
-          <w:rFonts w:asciiTheme="minorHAnsi" w:eastAsiaTheme="minorHAnsi" w:hAnsiTheme="minorHAnsi"/>
-          <w:color w:val="000000"/>
-          <w:sz w:val="22"/>
-          <w:szCs w:val="22"/>
-        </w:rPr>
-        <w:t xml:space="preserve"> 두 곳에 설문 문항을 배포했다. 조사에는 워</w:t>
-      </w:r>
-      <w:r>
-        <w:rPr>
-          <w:rFonts w:asciiTheme="minorHAnsi" w:eastAsiaTheme="minorHAnsi" w:hAnsiTheme="minorHAnsi" w:hint="eastAsia"/>
-          <w:color w:val="000000"/>
-          <w:sz w:val="22"/>
-          <w:szCs w:val="22"/>
-        </w:rPr>
-        <w:t>홀 준비 중인 사람</w:t>
-      </w:r>
-      <w:r>
-        <w:rPr>
-          <w:rFonts w:asciiTheme="minorHAnsi" w:eastAsiaTheme="minorHAnsi" w:hAnsiTheme="minorHAnsi"/>
-          <w:color w:val="000000"/>
-          <w:sz w:val="22"/>
-          <w:szCs w:val="22"/>
-        </w:rPr>
-        <w:t xml:space="preserve">, </w:t>
-      </w:r>
-      <w:r>
-        <w:rPr>
-          <w:rFonts w:asciiTheme="minorHAnsi" w:eastAsiaTheme="minorHAnsi" w:hAnsiTheme="minorHAnsi" w:hint="eastAsia"/>
-          <w:color w:val="000000"/>
-          <w:sz w:val="22"/>
-          <w:szCs w:val="22"/>
-        </w:rPr>
-        <w:t xml:space="preserve">현재 </w:t>
-      </w:r>
-      <w:r>
-        <w:rPr>
-          <w:rFonts w:asciiTheme="minorHAnsi" w:eastAsiaTheme="minorHAnsi" w:hAnsiTheme="minorHAnsi"/>
-          <w:color w:val="000000"/>
-          <w:sz w:val="22"/>
-          <w:szCs w:val="22"/>
-        </w:rPr>
-        <w:t>체류</w:t>
-      </w:r>
-      <w:r>
-        <w:rPr>
-          <w:rFonts w:asciiTheme="minorHAnsi" w:eastAsiaTheme="minorHAnsi" w:hAnsiTheme="minorHAnsi" w:hint="eastAsia"/>
-          <w:color w:val="000000"/>
-          <w:sz w:val="22"/>
-          <w:szCs w:val="22"/>
-        </w:rPr>
-        <w:t xml:space="preserve"> 중인 사람</w:t>
-      </w:r>
-      <w:r>
-        <w:rPr>
-          <w:rFonts w:asciiTheme="minorHAnsi" w:eastAsiaTheme="minorHAnsi" w:hAnsiTheme="minorHAnsi"/>
-          <w:color w:val="000000"/>
-          <w:sz w:val="22"/>
-          <w:szCs w:val="22"/>
-        </w:rPr>
-        <w:t xml:space="preserve">, </w:t>
-      </w:r>
-      <w:r>
-        <w:rPr>
-          <w:rFonts w:asciiTheme="minorHAnsi" w:eastAsiaTheme="minorHAnsi" w:hAnsiTheme="minorHAnsi" w:hint="eastAsia"/>
-          <w:color w:val="000000"/>
-          <w:sz w:val="22"/>
-          <w:szCs w:val="22"/>
-        </w:rPr>
-        <w:t>이미 귀국한 사람</w:t>
-      </w:r>
-      <w:r>
-        <w:rPr>
-          <w:rFonts w:asciiTheme="minorHAnsi" w:eastAsiaTheme="minorHAnsi" w:hAnsiTheme="minorHAnsi"/>
-          <w:color w:val="000000"/>
-          <w:sz w:val="22"/>
-          <w:szCs w:val="22"/>
-        </w:rPr>
-        <w:t xml:space="preserve"> </w:t>
-      </w:r>
-      <w:r>
-        <w:rPr>
-          <w:rFonts w:asciiTheme="minorHAnsi" w:eastAsiaTheme="minorHAnsi" w:hAnsiTheme="minorHAnsi"/>
-          <w:color w:val="000000"/>
-          <w:sz w:val="22"/>
-          <w:szCs w:val="22"/>
-        </w:rPr>
-        <w:t xml:space="preserve">등 총 18명이 참여했다. 나아가 설문 참여자 중 3명을 선정해 서면 및 대면 인터뷰를 추가로 </w:t>
-      </w:r>
-      <w:r>
-        <w:rPr>
-          <w:rFonts w:asciiTheme="minorHAnsi" w:eastAsiaTheme="minorHAnsi" w:hAnsiTheme="minorHAnsi" w:hint="eastAsia"/>
-          <w:color w:val="000000"/>
-          <w:sz w:val="22"/>
-          <w:szCs w:val="22"/>
-        </w:rPr>
-        <w:t>진행했다.</w:t>
+        <w:t xml:space="preserve"> 서면 및 대면 인터뷰를 진행했다.</w:t>
       </w:r>
     </w:p>
     <w:p>
       <w:pPr>
         <w:rPr>
-          <w:rFonts w:eastAsiaTheme="minorHAnsi" w:hint="eastAsia"/>
+          <w:rFonts w:eastAsiaTheme="minorHAnsi"/>
           <w:b/>
           <w:bCs/>
           <w:szCs w:val="22"/>
@@ -714,24 +886,197 @@
       </w:pPr>
       <w:r>
         <w:rPr>
+          <w:noProof/>
+        </w:rPr>
+        <mc:AlternateContent>
+          <mc:Choice Requires="wps">
+            <w:drawing>
+              <wp:anchor distT="0" distB="0" distL="114300" distR="114300" simplePos="0" relativeHeight="251662336" behindDoc="0" locked="0" layoutInCell="1" allowOverlap="1" wp14:anchorId="13F1D5E3" wp14:editId="6196CFCF">
+                <wp:simplePos x="0" y="0"/>
+                <wp:positionH relativeFrom="column">
+                  <wp:posOffset>1330325</wp:posOffset>
+                </wp:positionH>
+                <wp:positionV relativeFrom="paragraph">
+                  <wp:posOffset>2588895</wp:posOffset>
+                </wp:positionV>
+                <wp:extent cx="3141980" cy="635"/>
+                <wp:effectExtent l="0" t="0" r="0" b="12065"/>
+                <wp:wrapTopAndBottom/>
+                <wp:docPr id="1141262554" name="Text Box 1"/>
+                <wp:cNvGraphicFramePr/>
+                <a:graphic xmlns:a="http://schemas.openxmlformats.org/drawingml/2006/main">
+                  <a:graphicData uri="http://schemas.microsoft.com/office/word/2010/wordprocessingShape">
+                    <wps:wsp>
+                      <wps:cNvSpPr txBox="1"/>
+                      <wps:spPr>
+                        <a:xfrm>
+                          <a:off x="0" y="0"/>
+                          <a:ext cx="3141980" cy="635"/>
+                        </a:xfrm>
+                        <a:prstGeom prst="rect">
+                          <a:avLst/>
+                        </a:prstGeom>
+                        <a:solidFill>
+                          <a:prstClr val="white"/>
+                        </a:solidFill>
+                        <a:ln>
+                          <a:noFill/>
+                        </a:ln>
+                      </wps:spPr>
+                      <wps:txbx>
+                        <w:txbxContent>
+                          <w:p>
+                            <w:pPr>
+                              <w:pStyle w:val="af"/>
+                              <w:rPr>
+                                <w:rFonts w:eastAsiaTheme="minorHAnsi" w:hint="eastAsia"/>
+                                <w:noProof/>
+                                <w:szCs w:val="22"/>
+                              </w:rPr>
+                            </w:pPr>
+                            <w:r>
+                              <w:rPr>
+                                <w:rFonts w:eastAsiaTheme="minorHAnsi" w:hint="eastAsia"/>
+                                <w:b w:val="0"/>
+                                <w:bCs w:val="0"/>
+                                <w:noProof/>
+                                <w:szCs w:val="22"/>
+                              </w:rPr>
+                              <w:t>일본 워홀 중 고베의 관람열차에 탑승한 문윤정 씨가 카메라를 향해 환하게 웃고 있다.</w:t>
+                            </w:r>
+                          </w:p>
+                        </w:txbxContent>
+                      </wps:txbx>
+                      <wps:bodyPr rot="0" spcFirstLastPara="0" vertOverflow="overflow" horzOverflow="overflow" vert="horz" wrap="square" lIns="0" tIns="0" rIns="0" bIns="0" numCol="1" spcCol="0" rtlCol="0" fromWordArt="0" anchor="t" anchorCtr="0" forceAA="0" compatLnSpc="1">
+                        <a:prstTxWarp prst="textNoShape">
+                          <a:avLst/>
+                        </a:prstTxWarp>
+                        <a:spAutoFit/>
+                      </wps:bodyPr>
+                    </wps:wsp>
+                  </a:graphicData>
+                </a:graphic>
+              </wp:anchor>
+            </w:drawing>
+          </mc:Choice>
+          <mc:Fallback>
+            <w:pict>
+              <v:shapetype w14:anchorId="13F1D5E3" id="_x0000_t202" coordsize="21600,21600" o:spt="202" path="m,l,21600r21600,l21600,xe">
+                <v:stroke joinstyle="miter"/>
+                <v:path gradientshapeok="t" o:connecttype="rect"/>
+              </v:shapetype>
+              <v:shape id="Text Box 1" o:spid="_x0000_s1026" type="#_x0000_t202" style="position:absolute;margin-left:104.75pt;margin-top:203.85pt;width:247.4pt;height:.05pt;z-index:251662336;visibility:visible;mso-wrap-style:square;mso-wrap-distance-left:9pt;mso-wrap-distance-top:0;mso-wrap-distance-right:9pt;mso-wrap-distance-bottom:0;mso-position-horizontal:absolute;mso-position-horizontal-relative:text;mso-position-vertical:absolute;mso-position-vertical-relative:text;v-text-anchor:top" o:gfxdata="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" stroked="f">
+                <v:textbox style="mso-fit-shape-to-text:t" inset="0,0,0,0">
+                  <w:txbxContent>
+                    <w:p>
+                      <w:pPr>
+                        <w:pStyle w:val="af"/>
+                        <w:rPr>
+                          <w:rFonts w:eastAsiaTheme="minorHAnsi" w:hint="eastAsia"/>
+                          <w:noProof/>
+                          <w:szCs w:val="22"/>
+                        </w:rPr>
+                      </w:pPr>
+                      <w:r>
+                        <w:rPr>
+                          <w:rFonts w:eastAsiaTheme="minorHAnsi" w:hint="eastAsia"/>
+                          <w:b w:val="0"/>
+                          <w:bCs w:val="0"/>
+                          <w:noProof/>
+                          <w:szCs w:val="22"/>
+                        </w:rPr>
+                        <w:t>일본 워홀 중 고베의 관람열차에 탑승한 문윤정 씨가 카메라를 향해 환하게 웃고 있다.</w:t>
+                      </w:r>
+                    </w:p>
+                  </w:txbxContent>
+                </v:textbox>
+                <w10:wrap type="topAndBottom"/>
+              </v:shape>
+            </w:pict>
+          </mc:Fallback>
+        </mc:AlternateContent>
+      </w:r>
+      <w:r>
+        <w:rPr>
           <w:rFonts w:eastAsiaTheme="minorHAnsi"/>
           <w:b/>
           <w:bCs/>
-          <w:szCs w:val="22"/>
-        </w:rPr>
-        <w:t xml:space="preserve">#1. </w:t>
-      </w:r>
-      <w:proofErr w:type="spellStart"/>
-      <w:r>
-        <w:rPr>
-          <w:rFonts w:eastAsiaTheme="minorHAnsi" w:hint="eastAsia"/>
+          <w:noProof/>
+          <w:szCs w:val="22"/>
+        </w:rPr>
+        <w:drawing>
+          <wp:anchor distT="0" distB="0" distL="114300" distR="114300" simplePos="0" relativeHeight="251658240" behindDoc="0" locked="0" layoutInCell="1" allowOverlap="1" wp14:anchorId="1C0A0B69" wp14:editId="164E3CF7">
+            <wp:simplePos x="0" y="0"/>
+            <wp:positionH relativeFrom="column">
+              <wp:posOffset>1330325</wp:posOffset>
+            </wp:positionH>
+            <wp:positionV relativeFrom="paragraph">
+              <wp:posOffset>287209</wp:posOffset>
+            </wp:positionV>
+            <wp:extent cx="3141980" cy="2244725"/>
+            <wp:effectExtent l="0" t="0" r="0" b="3175"/>
+            <wp:wrapTopAndBottom/>
+            <wp:docPr id="623638206" name="그림 1"/>
+            <wp:cNvGraphicFramePr>
+              <a:graphicFrameLocks xmlns:a="http://schemas.openxmlformats.org/drawingml/2006/main"/>
+            </wp:cNvGraphicFramePr>
+            <a:graphic xmlns:a="http://schemas.openxmlformats.org/drawingml/2006/main">
+              <a:graphicData uri="http://schemas.openxmlformats.org/drawingml/2006/picture">
+                <pic:pic xmlns:pic="http://schemas.openxmlformats.org/drawingml/2006/picture">
+                  <pic:nvPicPr>
+                    <pic:cNvPr id="623638206" name="그림 623638206"/>
+                    <pic:cNvPicPr/>
+                  </pic:nvPicPr>
+                  <pic:blipFill rotWithShape="1">
+                    <a:blip r:embed="rId4" cstate="print">
+                      <a:extLst>
+                        <a:ext uri="{28A0092B-C50C-407E-A947-70E740481C1C}">
+                          <a14:useLocalDpi xmlns:a14="http://schemas.microsoft.com/office/drawing/2010/main" val="0"/>
+                        </a:ext>
+                      </a:extLst>
+                    </a:blip>
+                    <a:srcRect t="37994" b="29527"/>
+                    <a:stretch/>
+                  </pic:blipFill>
+                  <pic:spPr bwMode="auto">
+                    <a:xfrm>
+                      <a:off x="0" y="0"/>
+                      <a:ext cx="3141980" cy="2244725"/>
+                    </a:xfrm>
+                    <a:prstGeom prst="rect">
+                      <a:avLst/>
+                    </a:prstGeom>
+                    <a:ln>
+                      <a:noFill/>
+                    </a:ln>
+                    <a:extLst>
+                      <a:ext uri="{53640926-AAD7-44D8-BBD7-CCE9431645EC}">
+                        <a14:shadowObscured xmlns:a14="http://schemas.microsoft.com/office/drawing/2010/main"/>
+                      </a:ext>
+                    </a:extLst>
+                  </pic:spPr>
+                </pic:pic>
+              </a:graphicData>
+            </a:graphic>
+            <wp14:sizeRelH relativeFrom="margin">
+              <wp14:pctWidth>0</wp14:pctWidth>
+            </wp14:sizeRelH>
+            <wp14:sizeRelV relativeFrom="margin">
+              <wp14:pctHeight>0</wp14:pctHeight>
+            </wp14:sizeRelV>
+          </wp:anchor>
+        </w:drawing>
+      </w:r>
+      <w:r>
+        <w:rPr>
+          <w:rFonts w:eastAsiaTheme="minorHAnsi"/>
           <w:b/>
           <w:bCs/>
           <w:szCs w:val="22"/>
         </w:rPr>
-        <w:t>문윤정</w:t>
-      </w:r>
-      <w:proofErr w:type="spellEnd"/>
+        <w:t xml:space="preserve">#1. </w:t>
+      </w:r>
+      <w:proofErr w:type="spellStart"/>
       <w:r>
         <w:rPr>
           <w:rFonts w:eastAsiaTheme="minorHAnsi" w:hint="eastAsia"/>
@@ -739,25 +1084,26 @@
           <w:bCs/>
           <w:szCs w:val="22"/>
         </w:rPr>
-        <w:t xml:space="preserve"> </w:t>
-      </w:r>
-      <w:r>
-        <w:rPr>
-          <w:rFonts w:eastAsiaTheme="minorHAnsi"/>
+        <w:t>문윤정</w:t>
+      </w:r>
+      <w:proofErr w:type="spellEnd"/>
+      <w:r>
+        <w:rPr>
+          <w:rFonts w:eastAsiaTheme="minorHAnsi" w:hint="eastAsia"/>
           <w:b/>
           <w:bCs/>
           <w:szCs w:val="22"/>
         </w:rPr>
-        <w:t xml:space="preserve">: </w:t>
-      </w:r>
-      <w:r>
-        <w:rPr>
-          <w:rFonts w:eastAsiaTheme="minorHAnsi" w:hint="eastAsia"/>
+        <w:t xml:space="preserve"> </w:t>
+      </w:r>
+      <w:r>
+        <w:rPr>
+          <w:rFonts w:eastAsiaTheme="minorHAnsi"/>
           <w:b/>
           <w:bCs/>
           <w:szCs w:val="22"/>
         </w:rPr>
-        <w:t xml:space="preserve">뻔한 </w:t>
+        <w:t xml:space="preserve">: </w:t>
       </w:r>
       <w:r>
         <w:rPr>
@@ -766,7 +1112,7 @@
           <w:bCs/>
           <w:szCs w:val="22"/>
         </w:rPr>
-        <w:t>스펙</w:t>
+        <w:t xml:space="preserve">뻔한 </w:t>
       </w:r>
       <w:r>
         <w:rPr>
@@ -775,7 +1121,7 @@
           <w:bCs/>
           <w:szCs w:val="22"/>
         </w:rPr>
-        <w:t xml:space="preserve">보다 </w:t>
+        <w:t>스펙 대신 택한</w:t>
       </w:r>
       <w:r>
         <w:rPr>
@@ -784,22 +1130,40 @@
           <w:bCs/>
           <w:szCs w:val="22"/>
         </w:rPr>
-        <w:t xml:space="preserve">낯선 환경 속에서 나를 </w:t>
-      </w:r>
-      <w:r>
-        <w:rPr>
-          <w:rFonts w:eastAsiaTheme="minorHAnsi" w:hint="eastAsia"/>
+        <w:t xml:space="preserve"> </w:t>
+      </w:r>
+      <w:r>
+        <w:rPr>
+          <w:rFonts w:eastAsiaTheme="minorHAnsi"/>
           <w:b/>
           <w:bCs/>
           <w:szCs w:val="22"/>
         </w:rPr>
-        <w:t>알아가는 시간</w:t>
+        <w:t>‘</w:t>
+      </w:r>
+      <w:r>
+        <w:rPr>
+          <w:rFonts w:eastAsiaTheme="minorHAnsi" w:hint="eastAsia"/>
+          <w:b/>
+          <w:bCs/>
+          <w:szCs w:val="22"/>
+        </w:rPr>
+        <w:t>행복한 자유</w:t>
+      </w:r>
+      <w:r>
+        <w:rPr>
+          <w:rFonts w:eastAsiaTheme="minorHAnsi"/>
+          <w:b/>
+          <w:bCs/>
+          <w:szCs w:val="22"/>
+        </w:rPr>
+        <w:t>’</w:t>
       </w:r>
     </w:p>
     <w:p>
       <w:pPr>
         <w:rPr>
-          <w:rFonts w:eastAsiaTheme="minorHAnsi" w:hint="eastAsia"/>
+          <w:rFonts w:eastAsiaTheme="minorHAnsi"/>
           <w:szCs w:val="22"/>
         </w:rPr>
       </w:pPr>
@@ -880,6 +1244,7 @@
           <w:rFonts w:eastAsiaTheme="minorHAnsi" w:hint="eastAsia"/>
           <w:szCs w:val="22"/>
         </w:rPr>
+        <w:lastRenderedPageBreak/>
         <w:t xml:space="preserve">공모전을 나가거나 자격증을 딸 수 있는 </w:t>
       </w:r>
       <w:r>
@@ -1002,7 +1367,35 @@
           <w:rFonts w:eastAsiaTheme="minorHAnsi" w:hint="eastAsia"/>
           <w:szCs w:val="22"/>
         </w:rPr>
-        <w:t>낯선 환경에서 스스로를 시험해보고 싶다는 욕구였다.</w:t>
+        <w:t xml:space="preserve">낯선 환경에서 </w:t>
+      </w:r>
+      <w:r>
+        <w:rPr>
+          <w:rFonts w:eastAsiaTheme="minorHAnsi" w:hint="eastAsia"/>
+          <w:szCs w:val="22"/>
+        </w:rPr>
+        <w:t>자신을</w:t>
+      </w:r>
+      <w:r>
+        <w:rPr>
+          <w:rFonts w:eastAsiaTheme="minorHAnsi" w:hint="eastAsia"/>
+          <w:szCs w:val="22"/>
+        </w:rPr>
+        <w:t xml:space="preserve"> 시험해</w:t>
+      </w:r>
+      <w:r>
+        <w:rPr>
+          <w:rFonts w:eastAsiaTheme="minorHAnsi" w:hint="eastAsia"/>
+          <w:szCs w:val="22"/>
+        </w:rPr>
+        <w:t xml:space="preserve"> </w:t>
+      </w:r>
+      <w:r>
+        <w:rPr>
+          <w:rFonts w:eastAsiaTheme="minorHAnsi" w:hint="eastAsia"/>
+          <w:szCs w:val="22"/>
+        </w:rPr>
+        <w:t>보고 싶다는 욕구였다.</w:t>
       </w:r>
     </w:p>
     <w:p>
@@ -1093,7 +1486,7 @@
     <w:p>
       <w:pPr>
         <w:rPr>
-          <w:rFonts w:eastAsiaTheme="minorHAnsi" w:hint="eastAsia"/>
+          <w:rFonts w:eastAsiaTheme="minorHAnsi"/>
           <w:szCs w:val="22"/>
         </w:rPr>
       </w:pPr>
@@ -1183,7 +1576,7 @@
     <w:p>
       <w:pPr>
         <w:rPr>
-          <w:rFonts w:eastAsiaTheme="minorHAnsi" w:hint="eastAsia"/>
+          <w:rFonts w:eastAsiaTheme="minorHAnsi"/>
           <w:szCs w:val="22"/>
         </w:rPr>
       </w:pPr>
@@ -1205,7 +1598,7 @@
     <w:p>
       <w:pPr>
         <w:rPr>
-          <w:rFonts w:eastAsiaTheme="minorHAnsi" w:hint="eastAsia"/>
+          <w:rFonts w:eastAsiaTheme="minorHAnsi"/>
           <w:szCs w:val="22"/>
         </w:rPr>
       </w:pPr>
@@ -1214,7 +1607,6 @@
           <w:rFonts w:eastAsiaTheme="minorHAnsi"/>
           <w:szCs w:val="22"/>
         </w:rPr>
-        <w:lastRenderedPageBreak/>
         <w:t>“</w:t>
       </w:r>
       <w:r>
@@ -1303,7 +1695,7 @@
     <w:p>
       <w:pPr>
         <w:rPr>
-          <w:rFonts w:eastAsiaTheme="minorHAnsi" w:hint="eastAsia"/>
+          <w:rFonts w:eastAsiaTheme="minorHAnsi"/>
           <w:b/>
           <w:bCs/>
           <w:szCs w:val="22"/>
@@ -1311,33 +1703,195 @@
       </w:pPr>
       <w:r>
         <w:rPr>
-          <w:rFonts w:eastAsiaTheme="minorHAnsi" w:hint="eastAsia"/>
+          <w:noProof/>
+        </w:rPr>
+        <mc:AlternateContent>
+          <mc:Choice Requires="wps">
+            <w:drawing>
+              <wp:anchor distT="0" distB="0" distL="114300" distR="114300" simplePos="0" relativeHeight="251664384" behindDoc="0" locked="0" layoutInCell="1" allowOverlap="1" wp14:anchorId="57690479" wp14:editId="270A60E4">
+                <wp:simplePos x="0" y="0"/>
+                <wp:positionH relativeFrom="column">
+                  <wp:posOffset>1320165</wp:posOffset>
+                </wp:positionH>
+                <wp:positionV relativeFrom="paragraph">
+                  <wp:posOffset>2538730</wp:posOffset>
+                </wp:positionV>
+                <wp:extent cx="2851150" cy="635"/>
+                <wp:effectExtent l="0" t="0" r="6350" b="12065"/>
+                <wp:wrapTopAndBottom/>
+                <wp:docPr id="1974792578" name="Text Box 1"/>
+                <wp:cNvGraphicFramePr/>
+                <a:graphic xmlns:a="http://schemas.openxmlformats.org/drawingml/2006/main">
+                  <a:graphicData uri="http://schemas.microsoft.com/office/word/2010/wordprocessingShape">
+                    <wps:wsp>
+                      <wps:cNvSpPr txBox="1"/>
+                      <wps:spPr>
+                        <a:xfrm>
+                          <a:off x="0" y="0"/>
+                          <a:ext cx="2851150" cy="635"/>
+                        </a:xfrm>
+                        <a:prstGeom prst="rect">
+                          <a:avLst/>
+                        </a:prstGeom>
+                        <a:solidFill>
+                          <a:prstClr val="white"/>
+                        </a:solidFill>
+                        <a:ln>
+                          <a:noFill/>
+                        </a:ln>
+                      </wps:spPr>
+                      <wps:txbx>
+                        <w:txbxContent>
+                          <w:p>
+                            <w:pPr>
+                              <w:pStyle w:val="af"/>
+                              <w:rPr>
+                                <w:rFonts w:eastAsiaTheme="minorHAnsi" w:hint="eastAsia"/>
+                                <w:noProof/>
+                                <w:szCs w:val="22"/>
+                              </w:rPr>
+                            </w:pPr>
+                            <w:r>
+                              <w:rPr>
+                                <w:rFonts w:eastAsiaTheme="minorHAnsi" w:hint="eastAsia"/>
+                                <w:b w:val="0"/>
+                                <w:bCs w:val="0"/>
+                                <w:noProof/>
+                                <w:szCs w:val="22"/>
+                              </w:rPr>
+                              <w:t>호주 워홀 당시 김진렬 씨가 바다를 바라보며 여유로운 시간을 보내고 있다.</w:t>
+                            </w:r>
+                          </w:p>
+                        </w:txbxContent>
+                      </wps:txbx>
+                      <wps:bodyPr rot="0" spcFirstLastPara="0" vertOverflow="overflow" horzOverflow="overflow" vert="horz" wrap="square" lIns="0" tIns="0" rIns="0" bIns="0" numCol="1" spcCol="0" rtlCol="0" fromWordArt="0" anchor="t" anchorCtr="0" forceAA="0" compatLnSpc="1">
+                        <a:prstTxWarp prst="textNoShape">
+                          <a:avLst/>
+                        </a:prstTxWarp>
+                        <a:spAutoFit/>
+                      </wps:bodyPr>
+                    </wps:wsp>
+                  </a:graphicData>
+                </a:graphic>
+              </wp:anchor>
+            </w:drawing>
+          </mc:Choice>
+          <mc:Fallback>
+            <w:pict>
+              <v:shape w14:anchorId="57690479" id="_x0000_s1027" type="#_x0000_t202" style="position:absolute;margin-left:103.95pt;margin-top:199.9pt;width:224.5pt;height:.05pt;z-index:251664384;visibility:visible;mso-wrap-style:square;mso-wrap-distance-left:9pt;mso-wrap-distance-top:0;mso-wrap-distance-right:9pt;mso-wrap-distance-bottom:0;mso-position-horizontal:absolute;mso-position-horizontal-relative:text;mso-position-vertical:absolute;mso-position-vertical-relative:text;v-text-anchor:top" o:gfxdata="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" stroked="f">
+                <v:textbox style="mso-fit-shape-to-text:t" inset="0,0,0,0">
+                  <w:txbxContent>
+                    <w:p>
+                      <w:pPr>
+                        <w:pStyle w:val="af"/>
+                        <w:rPr>
+                          <w:rFonts w:eastAsiaTheme="minorHAnsi" w:hint="eastAsia"/>
+                          <w:noProof/>
+                          <w:szCs w:val="22"/>
+                        </w:rPr>
+                      </w:pPr>
+                      <w:r>
+                        <w:rPr>
+                          <w:rFonts w:eastAsiaTheme="minorHAnsi" w:hint="eastAsia"/>
+                          <w:b w:val="0"/>
+                          <w:bCs w:val="0"/>
+                          <w:noProof/>
+                          <w:szCs w:val="22"/>
+                        </w:rPr>
+                        <w:t>호주 워홀 당시 김진렬 씨가 바다를 바라보며 여유로운 시간을 보내고 있다.</w:t>
+                      </w:r>
+                    </w:p>
+                  </w:txbxContent>
+                </v:textbox>
+                <w10:wrap type="topAndBottom"/>
+              </v:shape>
+            </w:pict>
+          </mc:Fallback>
+        </mc:AlternateContent>
+      </w:r>
+      <w:r>
+        <w:rPr>
+          <w:rFonts w:eastAsiaTheme="minorHAnsi"/>
           <w:b/>
           <w:bCs/>
-          <w:szCs w:val="22"/>
-        </w:rPr>
-        <w:t>#</w:t>
-      </w:r>
-      <w:r>
-        <w:rPr>
-          <w:rFonts w:eastAsiaTheme="minorHAnsi"/>
+          <w:noProof/>
+          <w:szCs w:val="22"/>
+        </w:rPr>
+        <w:drawing>
+          <wp:anchor distT="0" distB="0" distL="114300" distR="114300" simplePos="0" relativeHeight="251659264" behindDoc="0" locked="0" layoutInCell="1" allowOverlap="1" wp14:anchorId="339AF9C4" wp14:editId="48D108DF">
+            <wp:simplePos x="0" y="0"/>
+            <wp:positionH relativeFrom="column">
+              <wp:posOffset>1320372</wp:posOffset>
+            </wp:positionH>
+            <wp:positionV relativeFrom="paragraph">
+              <wp:posOffset>344032</wp:posOffset>
+            </wp:positionV>
+            <wp:extent cx="2851200" cy="2138400"/>
+            <wp:effectExtent l="0" t="0" r="0" b="0"/>
+            <wp:wrapTopAndBottom/>
+            <wp:docPr id="1334637398" name="그림 2"/>
+            <wp:cNvGraphicFramePr>
+              <a:graphicFrameLocks xmlns:a="http://schemas.openxmlformats.org/drawingml/2006/main" noChangeAspect="1"/>
+            </wp:cNvGraphicFramePr>
+            <a:graphic xmlns:a="http://schemas.openxmlformats.org/drawingml/2006/main">
+              <a:graphicData uri="http://schemas.openxmlformats.org/drawingml/2006/picture">
+                <pic:pic xmlns:pic="http://schemas.openxmlformats.org/drawingml/2006/picture">
+                  <pic:nvPicPr>
+                    <pic:cNvPr id="1334637398" name="그림 1334637398"/>
+                    <pic:cNvPicPr/>
+                  </pic:nvPicPr>
+                  <pic:blipFill>
+                    <a:blip r:embed="rId5" cstate="print">
+                      <a:extLst>
+                        <a:ext uri="{28A0092B-C50C-407E-A947-70E740481C1C}">
+                          <a14:useLocalDpi xmlns:a14="http://schemas.microsoft.com/office/drawing/2010/main" val="0"/>
+                        </a:ext>
+                      </a:extLst>
+                    </a:blip>
+                    <a:stretch>
+                      <a:fillRect/>
+                    </a:stretch>
+                  </pic:blipFill>
+                  <pic:spPr>
+                    <a:xfrm>
+                      <a:off x="0" y="0"/>
+                      <a:ext cx="2851200" cy="2138400"/>
+                    </a:xfrm>
+                    <a:prstGeom prst="rect">
+                      <a:avLst/>
+                    </a:prstGeom>
+                  </pic:spPr>
+                </pic:pic>
+              </a:graphicData>
+            </a:graphic>
+            <wp14:sizeRelH relativeFrom="margin">
+              <wp14:pctWidth>0</wp14:pctWidth>
+            </wp14:sizeRelH>
+            <wp14:sizeRelV relativeFrom="margin">
+              <wp14:pctHeight>0</wp14:pctHeight>
+            </wp14:sizeRelV>
+          </wp:anchor>
+        </w:drawing>
+      </w:r>
+      <w:r>
+        <w:rPr>
+          <w:rFonts w:eastAsiaTheme="minorHAnsi" w:hint="eastAsia"/>
           <w:b/>
           <w:bCs/>
           <w:szCs w:val="22"/>
         </w:rPr>
-        <w:t xml:space="preserve">2. </w:t>
-      </w:r>
-      <w:proofErr w:type="spellStart"/>
-      <w:r>
-        <w:rPr>
-          <w:rFonts w:eastAsiaTheme="minorHAnsi" w:hint="eastAsia"/>
+        <w:t>#</w:t>
+      </w:r>
+      <w:r>
+        <w:rPr>
+          <w:rFonts w:eastAsiaTheme="minorHAnsi"/>
           <w:b/>
           <w:bCs/>
           <w:szCs w:val="22"/>
         </w:rPr>
-        <w:t>김진렬</w:t>
-      </w:r>
-      <w:proofErr w:type="spellEnd"/>
+        <w:t xml:space="preserve">2. </w:t>
+      </w:r>
+      <w:proofErr w:type="spellStart"/>
       <w:r>
         <w:rPr>
           <w:rFonts w:eastAsiaTheme="minorHAnsi" w:hint="eastAsia"/>
@@ -1345,25 +1899,26 @@
           <w:bCs/>
           <w:szCs w:val="22"/>
         </w:rPr>
-        <w:t xml:space="preserve"> </w:t>
-      </w:r>
-      <w:r>
-        <w:rPr>
-          <w:rFonts w:eastAsiaTheme="minorHAnsi"/>
+        <w:t>김진렬</w:t>
+      </w:r>
+      <w:proofErr w:type="spellEnd"/>
+      <w:r>
+        <w:rPr>
+          <w:rFonts w:eastAsiaTheme="minorHAnsi" w:hint="eastAsia"/>
           <w:b/>
           <w:bCs/>
           <w:szCs w:val="22"/>
         </w:rPr>
-        <w:t xml:space="preserve">: </w:t>
-      </w:r>
-      <w:r>
-        <w:rPr>
-          <w:rFonts w:eastAsiaTheme="minorHAnsi" w:hint="eastAsia"/>
+        <w:t xml:space="preserve"> </w:t>
+      </w:r>
+      <w:r>
+        <w:rPr>
+          <w:rFonts w:eastAsiaTheme="minorHAnsi"/>
           <w:b/>
           <w:bCs/>
           <w:szCs w:val="22"/>
         </w:rPr>
-        <w:t>내 적성을 발견</w:t>
+        <w:t xml:space="preserve">: </w:t>
       </w:r>
       <w:r>
         <w:rPr>
@@ -1372,22 +1927,13 @@
           <w:bCs/>
           <w:szCs w:val="22"/>
         </w:rPr>
-        <w:t>한</w:t>
-      </w:r>
-      <w:r>
-        <w:rPr>
-          <w:rFonts w:eastAsiaTheme="minorHAnsi" w:hint="eastAsia"/>
-          <w:b/>
-          <w:bCs/>
-          <w:szCs w:val="22"/>
-        </w:rPr>
-        <w:t xml:space="preserve"> 시간</w:t>
+        <w:t>외딴섬에서 찾은 나만의 방향</w:t>
       </w:r>
     </w:p>
     <w:p>
       <w:pPr>
         <w:rPr>
-          <w:rFonts w:eastAsiaTheme="minorHAnsi" w:hint="eastAsia"/>
+          <w:rFonts w:eastAsiaTheme="minorHAnsi"/>
           <w:szCs w:val="22"/>
         </w:rPr>
       </w:pPr>
@@ -1476,7 +2022,7 @@
     <w:p>
       <w:pPr>
         <w:rPr>
-          <w:rFonts w:eastAsiaTheme="minorHAnsi" w:hint="eastAsia"/>
+          <w:rFonts w:eastAsiaTheme="minorHAnsi"/>
           <w:szCs w:val="22"/>
         </w:rPr>
       </w:pPr>
@@ -1485,7 +2031,7 @@
           <w:rFonts w:eastAsiaTheme="minorHAnsi" w:hint="eastAsia"/>
           <w:szCs w:val="22"/>
         </w:rPr>
-        <w:t>호주에서의 워홀은 그의 진로를 바꿨다.</w:t>
+        <w:t>호주에서 워홀은 그의 진로를 바꿨다.</w:t>
       </w:r>
       <w:r>
         <w:rPr>
@@ -1564,7 +2110,7 @@
           <w:rFonts w:eastAsiaTheme="minorHAnsi" w:hint="eastAsia"/>
           <w:szCs w:val="22"/>
         </w:rPr>
-        <w:t xml:space="preserve">코로나 </w:t>
+        <w:t>코로나</w:t>
       </w:r>
       <w:r>
         <w:rPr>
@@ -1698,6 +2244,7 @@
           <w:rFonts w:eastAsiaTheme="minorHAnsi" w:hint="eastAsia"/>
           <w:szCs w:val="22"/>
         </w:rPr>
+        <w:lastRenderedPageBreak/>
         <w:t xml:space="preserve">물론 </w:t>
       </w:r>
       <w:r>
@@ -1811,21 +2358,35 @@
           <w:rFonts w:eastAsiaTheme="minorHAnsi" w:hint="eastAsia"/>
           <w:szCs w:val="22"/>
         </w:rPr>
-        <w:t>외딴 섬에서 스스로 돌아보고,</w:t>
-      </w:r>
-      <w:r>
-        <w:rPr>
-          <w:rFonts w:eastAsiaTheme="minorHAnsi"/>
-          <w:szCs w:val="22"/>
-        </w:rPr>
-        <w:t xml:space="preserve"> </w:t>
-      </w:r>
-      <w:r>
-        <w:rPr>
-          <w:rFonts w:eastAsiaTheme="minorHAnsi" w:hint="eastAsia"/>
-          <w:szCs w:val="22"/>
-        </w:rPr>
-        <w:t>어떤 삶을 원하는지 고민해볼 수 있는</w:t>
+        <w:t>외딴섬에서 스스로 돌아보고,</w:t>
+      </w:r>
+      <w:r>
+        <w:rPr>
+          <w:rFonts w:eastAsiaTheme="minorHAnsi"/>
+          <w:szCs w:val="22"/>
+        </w:rPr>
+        <w:t xml:space="preserve"> </w:t>
+      </w:r>
+      <w:r>
+        <w:rPr>
+          <w:rFonts w:eastAsiaTheme="minorHAnsi" w:hint="eastAsia"/>
+          <w:szCs w:val="22"/>
+        </w:rPr>
+        <w:t>어떤 삶을 원하는지 고민해</w:t>
+      </w:r>
+      <w:r>
+        <w:rPr>
+          <w:rFonts w:eastAsiaTheme="minorHAnsi" w:hint="eastAsia"/>
+          <w:szCs w:val="22"/>
+        </w:rPr>
+        <w:t xml:space="preserve"> </w:t>
+      </w:r>
+      <w:r>
+        <w:rPr>
+          <w:rFonts w:eastAsiaTheme="minorHAnsi" w:hint="eastAsia"/>
+          <w:szCs w:val="22"/>
+        </w:rPr>
+        <w:t>볼 수 있는</w:t>
       </w:r>
       <w:r>
         <w:rPr>
@@ -1889,66 +2450,395 @@
       </w:pPr>
       <w:r>
         <w:rPr>
+          <w:noProof/>
+        </w:rPr>
+        <mc:AlternateContent>
+          <mc:Choice Requires="wps">
+            <w:drawing>
+              <wp:anchor distT="0" distB="0" distL="114300" distR="114300" simplePos="0" relativeHeight="251666432" behindDoc="0" locked="0" layoutInCell="1" allowOverlap="1" wp14:anchorId="65B4A24F" wp14:editId="17EE451C">
+                <wp:simplePos x="0" y="0"/>
+                <wp:positionH relativeFrom="column">
+                  <wp:posOffset>1094740</wp:posOffset>
+                </wp:positionH>
+                <wp:positionV relativeFrom="paragraph">
+                  <wp:posOffset>2634615</wp:posOffset>
+                </wp:positionV>
+                <wp:extent cx="3557905" cy="635"/>
+                <wp:effectExtent l="0" t="0" r="0" b="12065"/>
+                <wp:wrapTopAndBottom/>
+                <wp:docPr id="469930836" name="Text Box 1"/>
+                <wp:cNvGraphicFramePr/>
+                <a:graphic xmlns:a="http://schemas.openxmlformats.org/drawingml/2006/main">
+                  <a:graphicData uri="http://schemas.microsoft.com/office/word/2010/wordprocessingShape">
+                    <wps:wsp>
+                      <wps:cNvSpPr txBox="1"/>
+                      <wps:spPr>
+                        <a:xfrm>
+                          <a:off x="0" y="0"/>
+                          <a:ext cx="3557905" cy="635"/>
+                        </a:xfrm>
+                        <a:prstGeom prst="rect">
+                          <a:avLst/>
+                        </a:prstGeom>
+                        <a:solidFill>
+                          <a:prstClr val="white"/>
+                        </a:solidFill>
+                        <a:ln>
+                          <a:noFill/>
+                        </a:ln>
+                      </wps:spPr>
+                      <wps:txbx>
+                        <w:txbxContent>
+                          <w:p>
+                            <w:pPr>
+                              <w:pStyle w:val="af"/>
+                              <w:rPr>
+                                <w:rFonts w:eastAsiaTheme="minorHAnsi" w:hint="eastAsia"/>
+                                <w:noProof/>
+                                <w:szCs w:val="22"/>
+                              </w:rPr>
+                            </w:pPr>
+                            <w:r>
+                              <w:rPr>
+                                <w:rFonts w:eastAsiaTheme="minorHAnsi" w:hint="eastAsia"/>
+                                <w:b w:val="0"/>
+                                <w:bCs w:val="0"/>
+                                <w:noProof/>
+                                <w:szCs w:val="22"/>
+                              </w:rPr>
+                              <w:t>캐나다의 한 해안 마을에서 윌리 씨가 카메라를 손에 쥔 채</w:t>
+                            </w:r>
+                            <w:r>
+                              <w:rPr>
+                                <w:rFonts w:eastAsiaTheme="minorHAnsi"/>
+                                <w:b w:val="0"/>
+                                <w:bCs w:val="0"/>
+                                <w:noProof/>
+                                <w:szCs w:val="22"/>
+                              </w:rPr>
+                              <w:t xml:space="preserve"> </w:t>
+                            </w:r>
+                            <w:r>
+                              <w:rPr>
+                                <w:rFonts w:eastAsiaTheme="minorHAnsi" w:hint="eastAsia"/>
+                                <w:b w:val="0"/>
+                                <w:bCs w:val="0"/>
+                                <w:noProof/>
+                                <w:szCs w:val="22"/>
+                              </w:rPr>
+                              <w:t>밝게 미소 짓고 있다.</w:t>
+                            </w:r>
+                          </w:p>
+                        </w:txbxContent>
+                      </wps:txbx>
+                      <wps:bodyPr rot="0" spcFirstLastPara="0" vertOverflow="overflow" horzOverflow="overflow" vert="horz" wrap="square" lIns="0" tIns="0" rIns="0" bIns="0" numCol="1" spcCol="0" rtlCol="0" fromWordArt="0" anchor="t" anchorCtr="0" forceAA="0" compatLnSpc="1">
+                        <a:prstTxWarp prst="textNoShape">
+                          <a:avLst/>
+                        </a:prstTxWarp>
+                        <a:spAutoFit/>
+                      </wps:bodyPr>
+                    </wps:wsp>
+                  </a:graphicData>
+                </a:graphic>
+              </wp:anchor>
+            </w:drawing>
+          </mc:Choice>
+          <mc:Fallback>
+            <w:pict>
+              <v:shape w14:anchorId="65B4A24F" id="_x0000_s1028" type="#_x0000_t202" style="position:absolute;margin-left:86.2pt;margin-top:207.45pt;width:280.15pt;height:.05pt;z-index:251666432;visibility:visible;mso-wrap-style:square;mso-wrap-distance-left:9pt;mso-wrap-distance-top:0;mso-wrap-distance-right:9pt;mso-wrap-distance-bottom:0;mso-position-horizontal:absolute;mso-position-horizontal-relative:text;mso-position-vertical:absolute;mso-position-vertical-relative:text;v-text-anchor:top" o:gfxdata="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" stroked="f">
+                <v:textbox style="mso-fit-shape-to-text:t" inset="0,0,0,0">
+                  <w:txbxContent>
+                    <w:p>
+                      <w:pPr>
+                        <w:pStyle w:val="af"/>
+                        <w:rPr>
+                          <w:rFonts w:eastAsiaTheme="minorHAnsi" w:hint="eastAsia"/>
+                          <w:noProof/>
+                          <w:szCs w:val="22"/>
+                        </w:rPr>
+                      </w:pPr>
+                      <w:r>
+                        <w:rPr>
+                          <w:rFonts w:eastAsiaTheme="minorHAnsi" w:hint="eastAsia"/>
+                          <w:b w:val="0"/>
+                          <w:bCs w:val="0"/>
+                          <w:noProof/>
+                          <w:szCs w:val="22"/>
+                        </w:rPr>
+                        <w:t>캐나다의 한 해안 마을에서 윌리 씨가 카메라를 손에 쥔 채</w:t>
+                      </w:r>
+                      <w:r>
+                        <w:rPr>
+                          <w:rFonts w:eastAsiaTheme="minorHAnsi"/>
+                          <w:b w:val="0"/>
+                          <w:bCs w:val="0"/>
+                          <w:noProof/>
+                          <w:szCs w:val="22"/>
+                        </w:rPr>
+                        <w:t xml:space="preserve"> </w:t>
+                      </w:r>
+                      <w:r>
+                        <w:rPr>
+                          <w:rFonts w:eastAsiaTheme="minorHAnsi" w:hint="eastAsia"/>
+                          <w:b w:val="0"/>
+                          <w:bCs w:val="0"/>
+                          <w:noProof/>
+                          <w:szCs w:val="22"/>
+                        </w:rPr>
+                        <w:t>밝게 미소 짓고 있다.</w:t>
+                      </w:r>
+                    </w:p>
+                  </w:txbxContent>
+                </v:textbox>
+                <w10:wrap type="topAndBottom"/>
+              </v:shape>
+            </w:pict>
+          </mc:Fallback>
+        </mc:AlternateContent>
+      </w:r>
+      <w:r>
+        <w:rPr>
           <w:rFonts w:eastAsiaTheme="minorHAnsi"/>
           <w:b/>
           <w:bCs/>
-          <w:szCs w:val="22"/>
-        </w:rPr>
-        <w:t xml:space="preserve">#3. </w:t>
-      </w:r>
-      <w:r>
-        <w:rPr>
-          <w:rFonts w:eastAsiaTheme="minorHAnsi" w:hint="eastAsia"/>
+          <w:noProof/>
+          <w:szCs w:val="22"/>
+        </w:rPr>
+        <w:drawing>
+          <wp:anchor distT="0" distB="0" distL="114300" distR="114300" simplePos="0" relativeHeight="251660288" behindDoc="0" locked="0" layoutInCell="1" allowOverlap="1" wp14:anchorId="45BB20D0" wp14:editId="1877D91E">
+            <wp:simplePos x="0" y="0"/>
+            <wp:positionH relativeFrom="column">
+              <wp:posOffset>1094740</wp:posOffset>
+            </wp:positionH>
+            <wp:positionV relativeFrom="paragraph">
+              <wp:posOffset>369954</wp:posOffset>
+            </wp:positionV>
+            <wp:extent cx="3557905" cy="2207895"/>
+            <wp:effectExtent l="0" t="0" r="0" b="1905"/>
+            <wp:wrapTopAndBottom/>
+            <wp:docPr id="945452700" name="그림 3"/>
+            <wp:cNvGraphicFramePr>
+              <a:graphicFrameLocks xmlns:a="http://schemas.openxmlformats.org/drawingml/2006/main" noChangeAspect="1"/>
+            </wp:cNvGraphicFramePr>
+            <a:graphic xmlns:a="http://schemas.openxmlformats.org/drawingml/2006/main">
+              <a:graphicData uri="http://schemas.openxmlformats.org/drawingml/2006/picture">
+                <pic:pic xmlns:pic="http://schemas.openxmlformats.org/drawingml/2006/picture">
+                  <pic:nvPicPr>
+                    <pic:cNvPr id="945452700" name="그림 945452700"/>
+                    <pic:cNvPicPr/>
+                  </pic:nvPicPr>
+                  <pic:blipFill>
+                    <a:blip r:embed="rId6" cstate="print">
+                      <a:extLst>
+                        <a:ext uri="{28A0092B-C50C-407E-A947-70E740481C1C}">
+                          <a14:useLocalDpi xmlns:a14="http://schemas.microsoft.com/office/drawing/2010/main" val="0"/>
+                        </a:ext>
+                      </a:extLst>
+                    </a:blip>
+                    <a:stretch>
+                      <a:fillRect/>
+                    </a:stretch>
+                  </pic:blipFill>
+                  <pic:spPr>
+                    <a:xfrm>
+                      <a:off x="0" y="0"/>
+                      <a:ext cx="3557905" cy="2207895"/>
+                    </a:xfrm>
+                    <a:prstGeom prst="rect">
+                      <a:avLst/>
+                    </a:prstGeom>
+                  </pic:spPr>
+                </pic:pic>
+              </a:graphicData>
+            </a:graphic>
+            <wp14:sizeRelH relativeFrom="margin">
+              <wp14:pctWidth>0</wp14:pctWidth>
+            </wp14:sizeRelH>
+            <wp14:sizeRelV relativeFrom="margin">
+              <wp14:pctHeight>0</wp14:pctHeight>
+            </wp14:sizeRelV>
+          </wp:anchor>
+        </w:drawing>
+      </w:r>
+      <w:r>
+        <w:rPr>
+          <w:rFonts w:eastAsiaTheme="minorHAnsi"/>
           <w:b/>
           <w:bCs/>
           <w:szCs w:val="22"/>
         </w:rPr>
-        <w:t xml:space="preserve">윌리 </w:t>
-      </w:r>
-      <w:r>
-        <w:rPr>
-          <w:rFonts w:eastAsiaTheme="minorHAnsi"/>
+        <w:t xml:space="preserve">#3. </w:t>
+      </w:r>
+      <w:r>
+        <w:rPr>
+          <w:rFonts w:eastAsiaTheme="minorHAnsi" w:hint="eastAsia"/>
           <w:b/>
           <w:bCs/>
           <w:szCs w:val="22"/>
         </w:rPr>
-        <w:t xml:space="preserve">: </w:t>
-      </w:r>
-      <w:r>
-        <w:rPr>
-          <w:rFonts w:eastAsiaTheme="minorHAnsi" w:hint="eastAsia"/>
+        <w:t xml:space="preserve">윌리 </w:t>
+      </w:r>
+      <w:r>
+        <w:rPr>
+          <w:rFonts w:eastAsiaTheme="minorHAnsi"/>
           <w:b/>
           <w:bCs/>
           <w:szCs w:val="22"/>
         </w:rPr>
-        <w:t>4번의 워홀</w:t>
-      </w:r>
-      <w:r>
-        <w:rPr>
-          <w:rFonts w:eastAsiaTheme="minorHAnsi"/>
+        <w:t xml:space="preserve">: </w:t>
+      </w:r>
+      <w:r>
+        <w:rPr>
+          <w:rFonts w:eastAsiaTheme="minorHAnsi" w:hint="eastAsia"/>
           <w:b/>
           <w:bCs/>
           <w:szCs w:val="22"/>
         </w:rPr>
-        <w:t xml:space="preserve">, </w:t>
-      </w:r>
-      <w:r>
-        <w:rPr>
-          <w:rFonts w:eastAsiaTheme="minorHAnsi" w:hint="eastAsia"/>
+        <w:t>4번의 워홀</w:t>
+      </w:r>
+      <w:r>
+        <w:rPr>
+          <w:rFonts w:eastAsiaTheme="minorHAnsi"/>
           <w:b/>
           <w:bCs/>
           <w:szCs w:val="22"/>
         </w:rPr>
-        <w:t>그것의 원동력은 경험</w:t>
+        <w:t>,</w:t>
+      </w:r>
+      <w:r>
+        <w:rPr>
+          <w:rFonts w:eastAsiaTheme="minorHAnsi"/>
+          <w:b/>
+          <w:bCs/>
+          <w:szCs w:val="22"/>
+        </w:rPr>
+        <w:t xml:space="preserve"> </w:t>
+      </w:r>
+      <w:r>
+        <w:rPr>
+          <w:rFonts w:eastAsiaTheme="minorHAnsi" w:hint="eastAsia"/>
+          <w:b/>
+          <w:bCs/>
+          <w:szCs w:val="22"/>
+        </w:rPr>
+        <w:t xml:space="preserve">원동력은 </w:t>
+      </w:r>
+      <w:r>
+        <w:rPr>
+          <w:rFonts w:eastAsiaTheme="minorHAnsi"/>
+          <w:b/>
+          <w:bCs/>
+          <w:szCs w:val="22"/>
+        </w:rPr>
+        <w:t>‘</w:t>
+      </w:r>
+      <w:r>
+        <w:rPr>
+          <w:rFonts w:eastAsiaTheme="minorHAnsi" w:hint="eastAsia"/>
+          <w:b/>
+          <w:bCs/>
+          <w:szCs w:val="22"/>
+        </w:rPr>
+        <w:t>나와 세상을 재발견하는 시각</w:t>
+      </w:r>
+      <w:r>
+        <w:rPr>
+          <w:rFonts w:eastAsiaTheme="minorHAnsi"/>
+          <w:b/>
+          <w:bCs/>
+          <w:szCs w:val="22"/>
+        </w:rPr>
+        <w:t>’</w:t>
       </w:r>
     </w:p>
     <w:p>
       <w:pPr>
         <w:rPr>
-          <w:rFonts w:eastAsiaTheme="minorHAnsi" w:hint="eastAsia"/>
+          <w:rFonts w:eastAsiaTheme="minorHAnsi"/>
           <w:szCs w:val="22"/>
         </w:rPr>
       </w:pPr>
+      <w:proofErr w:type="spellStart"/>
+      <w:r>
+        <w:rPr>
+          <w:rFonts w:eastAsiaTheme="minorHAnsi" w:hint="eastAsia"/>
+          <w:szCs w:val="22"/>
+        </w:rPr>
+        <w:t>유튜버</w:t>
+      </w:r>
+      <w:proofErr w:type="spellEnd"/>
+      <w:r>
+        <w:rPr>
+          <w:rFonts w:eastAsiaTheme="minorHAnsi" w:hint="eastAsia"/>
+          <w:szCs w:val="22"/>
+        </w:rPr>
+        <w:t xml:space="preserve"> </w:t>
+      </w:r>
+      <w:r>
+        <w:rPr>
+          <w:rFonts w:eastAsiaTheme="minorHAnsi"/>
+          <w:szCs w:val="22"/>
+        </w:rPr>
+        <w:t>‘</w:t>
+      </w:r>
+      <w:r>
+        <w:rPr>
+          <w:rFonts w:eastAsiaTheme="minorHAnsi" w:hint="eastAsia"/>
+          <w:szCs w:val="22"/>
+        </w:rPr>
+        <w:t>윌리</w:t>
+      </w:r>
+      <w:r>
+        <w:rPr>
+          <w:rFonts w:eastAsiaTheme="minorHAnsi"/>
+          <w:szCs w:val="22"/>
+        </w:rPr>
+        <w:t xml:space="preserve">’ </w:t>
+      </w:r>
+      <w:r>
+        <w:rPr>
+          <w:rFonts w:eastAsiaTheme="minorHAnsi" w:hint="eastAsia"/>
+          <w:szCs w:val="22"/>
+        </w:rPr>
+        <w:t>씨는 현재 네</w:t>
+      </w:r>
+      <w:r>
+        <w:rPr>
+          <w:rFonts w:eastAsiaTheme="minorHAnsi" w:hint="eastAsia"/>
+          <w:szCs w:val="22"/>
+        </w:rPr>
+        <w:t xml:space="preserve"> </w:t>
+      </w:r>
+      <w:r>
+        <w:rPr>
+          <w:rFonts w:eastAsiaTheme="minorHAnsi" w:hint="eastAsia"/>
+          <w:szCs w:val="22"/>
+        </w:rPr>
+        <w:t xml:space="preserve">번째 </w:t>
+      </w:r>
+      <w:proofErr w:type="spellStart"/>
+      <w:r>
+        <w:rPr>
+          <w:rFonts w:eastAsiaTheme="minorHAnsi" w:hint="eastAsia"/>
+          <w:szCs w:val="22"/>
+        </w:rPr>
+        <w:t>워킹홀리데이를</w:t>
+      </w:r>
+      <w:proofErr w:type="spellEnd"/>
+      <w:r>
+        <w:rPr>
+          <w:rFonts w:eastAsiaTheme="minorHAnsi" w:hint="eastAsia"/>
+          <w:szCs w:val="22"/>
+        </w:rPr>
+        <w:t xml:space="preserve"> 하고 있다.</w:t>
+      </w:r>
+      <w:r>
+        <w:rPr>
+          <w:rFonts w:eastAsiaTheme="minorHAnsi"/>
+          <w:szCs w:val="22"/>
+        </w:rPr>
+        <w:t xml:space="preserve"> </w:t>
+      </w:r>
       <w:r>
         <w:rPr>
           <w:rFonts w:eastAsiaTheme="minorHAnsi" w:hint="eastAsia"/>
@@ -1996,114 +2886,56 @@
           <w:rFonts w:eastAsiaTheme="minorHAnsi" w:hint="eastAsia"/>
           <w:szCs w:val="22"/>
         </w:rPr>
-        <w:t>캐나다.</w:t>
-      </w:r>
-      <w:r>
-        <w:rPr>
-          <w:rFonts w:eastAsiaTheme="minorHAnsi"/>
-          <w:szCs w:val="22"/>
-        </w:rPr>
-        <w:t xml:space="preserve"> </w:t>
-      </w:r>
-      <w:r>
-        <w:rPr>
-          <w:rFonts w:eastAsiaTheme="minorHAnsi" w:hint="eastAsia"/>
-          <w:szCs w:val="22"/>
-        </w:rPr>
-        <w:t>현재 캐나다</w:t>
-      </w:r>
-      <w:r>
-        <w:rPr>
-          <w:rFonts w:eastAsiaTheme="minorHAnsi" w:hint="eastAsia"/>
-          <w:szCs w:val="22"/>
-        </w:rPr>
-        <w:t xml:space="preserve">에서 생활 중인 </w:t>
-      </w:r>
-      <w:r>
-        <w:rPr>
-          <w:rFonts w:eastAsiaTheme="minorHAnsi"/>
-          <w:szCs w:val="22"/>
-        </w:rPr>
-        <w:t>‘</w:t>
-      </w:r>
-      <w:r>
-        <w:rPr>
-          <w:rFonts w:eastAsiaTheme="minorHAnsi" w:hint="eastAsia"/>
-          <w:szCs w:val="22"/>
-        </w:rPr>
-        <w:t>윌리</w:t>
-      </w:r>
-      <w:r>
-        <w:rPr>
-          <w:rFonts w:eastAsiaTheme="minorHAnsi"/>
-          <w:szCs w:val="22"/>
-        </w:rPr>
-        <w:t xml:space="preserve">’ </w:t>
-      </w:r>
-      <w:r>
-        <w:rPr>
-          <w:rFonts w:eastAsiaTheme="minorHAnsi" w:hint="eastAsia"/>
-          <w:szCs w:val="22"/>
-        </w:rPr>
-        <w:t xml:space="preserve">씨는 </w:t>
-      </w:r>
-      <w:proofErr w:type="spellStart"/>
-      <w:r>
-        <w:rPr>
-          <w:rFonts w:eastAsiaTheme="minorHAnsi" w:hint="eastAsia"/>
-          <w:szCs w:val="22"/>
-        </w:rPr>
-        <w:t>워킹홀리데이를</w:t>
-      </w:r>
-      <w:proofErr w:type="spellEnd"/>
-      <w:r>
-        <w:rPr>
-          <w:rFonts w:eastAsiaTheme="minorHAnsi" w:hint="eastAsia"/>
-          <w:szCs w:val="22"/>
-        </w:rPr>
-        <w:t xml:space="preserve"> 네 차례 경험했다.</w:t>
-      </w:r>
-      <w:r>
-        <w:rPr>
-          <w:rFonts w:eastAsiaTheme="minorHAnsi"/>
-          <w:szCs w:val="22"/>
-        </w:rPr>
-        <w:t xml:space="preserve"> </w:t>
-      </w:r>
-      <w:r>
-        <w:rPr>
-          <w:rFonts w:eastAsiaTheme="minorHAnsi" w:hint="eastAsia"/>
-          <w:szCs w:val="22"/>
-        </w:rPr>
-        <w:t xml:space="preserve">그 경험을 살려 현재는 </w:t>
-      </w:r>
-      <w:r>
-        <w:rPr>
-          <w:rFonts w:eastAsiaTheme="minorHAnsi"/>
-          <w:szCs w:val="22"/>
-        </w:rPr>
-        <w:t>‘</w:t>
-      </w:r>
-      <w:r>
-        <w:rPr>
-          <w:rFonts w:eastAsiaTheme="minorHAnsi" w:hint="eastAsia"/>
-          <w:szCs w:val="22"/>
-        </w:rPr>
-        <w:t>윌리</w:t>
-      </w:r>
-      <w:r>
-        <w:rPr>
-          <w:rFonts w:eastAsiaTheme="minorHAnsi"/>
-          <w:szCs w:val="22"/>
-        </w:rPr>
-        <w:t>’</w:t>
-      </w:r>
-      <w:r>
-        <w:rPr>
-          <w:rFonts w:eastAsiaTheme="minorHAnsi" w:hint="eastAsia"/>
-          <w:szCs w:val="22"/>
-        </w:rPr>
-        <w:t>라는 이름으로 워홀 유튜브를 운영하며</w:t>
+        <w:t>그리고</w:t>
+      </w:r>
+      <w:r>
+        <w:rPr>
+          <w:rFonts w:eastAsiaTheme="minorHAnsi"/>
+          <w:szCs w:val="22"/>
+        </w:rPr>
+        <w:t xml:space="preserve"> </w:t>
+      </w:r>
+      <w:r>
+        <w:rPr>
+          <w:rFonts w:eastAsiaTheme="minorHAnsi" w:hint="eastAsia"/>
+          <w:szCs w:val="22"/>
+        </w:rPr>
+        <w:t>캐나다</w:t>
+      </w:r>
+      <w:r>
+        <w:rPr>
+          <w:rFonts w:eastAsiaTheme="minorHAnsi" w:hint="eastAsia"/>
+          <w:szCs w:val="22"/>
+        </w:rPr>
+        <w:t>까지</w:t>
+      </w:r>
+      <w:r>
+        <w:rPr>
+          <w:rFonts w:eastAsiaTheme="minorHAnsi" w:hint="eastAsia"/>
+          <w:szCs w:val="22"/>
+        </w:rPr>
+        <w:t>.</w:t>
+      </w:r>
+      <w:r>
+        <w:rPr>
+          <w:rFonts w:eastAsiaTheme="minorHAnsi"/>
+          <w:szCs w:val="22"/>
+        </w:rPr>
+        <w:t xml:space="preserve"> </w:t>
+      </w:r>
+      <w:r>
+        <w:rPr>
+          <w:rFonts w:eastAsiaTheme="minorHAnsi" w:hint="eastAsia"/>
+          <w:szCs w:val="22"/>
+        </w:rPr>
+        <w:t xml:space="preserve">현재 </w:t>
+      </w:r>
+      <w:r>
+        <w:rPr>
+          <w:rFonts w:eastAsiaTheme="minorHAnsi" w:hint="eastAsia"/>
+          <w:szCs w:val="22"/>
+        </w:rPr>
+        <w:t>그 경험을 살려 유튜브를 운영하며</w:t>
       </w:r>
       <w:r>
         <w:rPr>
@@ -2123,7 +2955,7 @@
     <w:p>
       <w:pPr>
         <w:rPr>
-          <w:rFonts w:eastAsiaTheme="minorHAnsi" w:hint="eastAsia"/>
+          <w:rFonts w:eastAsiaTheme="minorHAnsi"/>
           <w:szCs w:val="22"/>
         </w:rPr>
       </w:pPr>
@@ -2357,23 +3189,21 @@
           <w:rFonts w:eastAsiaTheme="minorHAnsi" w:hint="eastAsia"/>
           <w:szCs w:val="22"/>
         </w:rPr>
-        <w:t xml:space="preserve">영어권 나라로 워홀을 </w:t>
-      </w:r>
-      <w:proofErr w:type="spellStart"/>
-      <w:r>
-        <w:rPr>
-          <w:rFonts w:eastAsiaTheme="minorHAnsi" w:hint="eastAsia"/>
-          <w:szCs w:val="22"/>
-        </w:rPr>
-        <w:t>이어나가고</w:t>
-      </w:r>
-      <w:proofErr w:type="spellEnd"/>
-      <w:r>
-        <w:rPr>
-          <w:rFonts w:eastAsiaTheme="minorHAnsi" w:hint="eastAsia"/>
-          <w:szCs w:val="22"/>
-        </w:rPr>
-        <w:t xml:space="preserve"> 있어요.</w:t>
+        <w:t>영어권 나라로 워홀을 이어</w:t>
+      </w:r>
+      <w:r>
+        <w:rPr>
+          <w:rFonts w:eastAsiaTheme="minorHAnsi" w:hint="eastAsia"/>
+          <w:szCs w:val="22"/>
+        </w:rPr>
+        <w:t xml:space="preserve"> </w:t>
+      </w:r>
+      <w:r>
+        <w:rPr>
+          <w:rFonts w:eastAsiaTheme="minorHAnsi" w:hint="eastAsia"/>
+          <w:szCs w:val="22"/>
+        </w:rPr>
+        <w:t>나가고 있어요.</w:t>
       </w:r>
       <w:r>
         <w:rPr>
@@ -2523,13 +3353,13 @@
           <w:rFonts w:eastAsiaTheme="minorHAnsi" w:hint="eastAsia"/>
           <w:szCs w:val="22"/>
         </w:rPr>
-        <w:t>그 중 가장 기억에 남는 건 바나나농장에서의 일이었다.</w:t>
+        <w:t>그중 가장 기억에 남는 건 바나나농장에서의 일이었다.</w:t>
       </w:r>
     </w:p>
     <w:p>
       <w:pPr>
         <w:rPr>
-          <w:rFonts w:eastAsiaTheme="minorHAnsi" w:hint="eastAsia"/>
+          <w:rFonts w:eastAsiaTheme="minorHAnsi"/>
           <w:szCs w:val="22"/>
         </w:rPr>
       </w:pPr>
@@ -2700,7 +3530,25 @@
           <w:kern w:val="0"/>
           <w:szCs w:val="22"/>
         </w:rPr>
-        <w:t>안되게</w:t>
+        <w:t>안</w:t>
+      </w:r>
+      <w:r>
+        <w:rPr>
+          <w:rFonts w:eastAsiaTheme="minorHAnsi" w:cs="Apple SD Gothic Neo" w:hint="eastAsia"/>
+          <w:color w:val="1A1A1A"/>
+          <w:kern w:val="0"/>
+          <w:szCs w:val="22"/>
+        </w:rPr>
+        <w:t xml:space="preserve"> </w:t>
+      </w:r>
+      <w:r>
+        <w:rPr>
+          <w:rFonts w:eastAsiaTheme="minorHAnsi" w:cs="Apple SD Gothic Neo" w:hint="eastAsia"/>
+          <w:color w:val="1A1A1A"/>
+          <w:kern w:val="0"/>
+          <w:szCs w:val="22"/>
+        </w:rPr>
+        <w:t>되게</w:t>
       </w:r>
       <w:r>
         <w:rPr>
@@ -2900,22 +3748,13 @@
           <w:kern w:val="0"/>
           <w:szCs w:val="22"/>
         </w:rPr>
-        <w:t>.</w:t>
-      </w:r>
-      <w:r>
-        <w:rPr>
-          <w:rFonts w:eastAsiaTheme="minorHAnsi" w:cs="Arial"/>
-          <w:color w:val="1A1A1A"/>
-          <w:kern w:val="0"/>
-          <w:szCs w:val="22"/>
-        </w:rPr>
-        <w:t>”</w:t>
+        <w:t>.”</w:t>
       </w:r>
     </w:p>
     <w:p>
       <w:pPr>
         <w:rPr>
-          <w:rFonts w:eastAsiaTheme="minorHAnsi" w:hint="eastAsia"/>
+          <w:rFonts w:eastAsiaTheme="minorHAnsi"/>
           <w:szCs w:val="22"/>
         </w:rPr>
       </w:pPr>
@@ -2924,29 +3763,36 @@
           <w:rFonts w:eastAsiaTheme="minorHAnsi" w:hint="eastAsia"/>
           <w:szCs w:val="22"/>
         </w:rPr>
+        <w:t>그가 이야기하는 워홀의 가장 큰 가치는 스스로</w:t>
+      </w:r>
+      <w:r>
+        <w:rPr>
+          <w:rFonts w:eastAsiaTheme="minorHAnsi" w:hint="eastAsia"/>
+          <w:szCs w:val="22"/>
+        </w:rPr>
+        <w:t>를 제대로 바라볼</w:t>
+      </w:r>
+      <w:r>
+        <w:rPr>
+          <w:rFonts w:eastAsiaTheme="minorHAnsi"/>
+          <w:szCs w:val="22"/>
+        </w:rPr>
+        <w:t xml:space="preserve"> </w:t>
+      </w:r>
+      <w:r>
+        <w:rPr>
+          <w:rFonts w:eastAsiaTheme="minorHAnsi" w:hint="eastAsia"/>
+          <w:szCs w:val="22"/>
+        </w:rPr>
+        <w:t>수 있게 된다는 것이었</w:t>
+      </w:r>
+      <w:r>
+        <w:rPr>
+          <w:rFonts w:eastAsiaTheme="minorHAnsi" w:hint="eastAsia"/>
+          <w:szCs w:val="22"/>
+        </w:rPr>
         <w:lastRenderedPageBreak/>
-        <w:t>그가 이야기하는 워홀의 가장 큰 가치는 스스로</w:t>
-      </w:r>
-      <w:r>
-        <w:rPr>
-          <w:rFonts w:eastAsiaTheme="minorHAnsi" w:hint="eastAsia"/>
-          <w:szCs w:val="22"/>
-        </w:rPr>
-        <w:t>를 제대로 바라볼</w:t>
-      </w:r>
-      <w:r>
-        <w:rPr>
-          <w:rFonts w:eastAsiaTheme="minorHAnsi"/>
-          <w:szCs w:val="22"/>
-        </w:rPr>
-        <w:t xml:space="preserve"> </w:t>
-      </w:r>
-      <w:r>
-        <w:rPr>
-          <w:rFonts w:eastAsiaTheme="minorHAnsi" w:hint="eastAsia"/>
-          <w:szCs w:val="22"/>
-        </w:rPr>
-        <w:t>수 있게 된다는 것이었다.</w:t>
+        <w:t>다.</w:t>
       </w:r>
     </w:p>
     <w:p>
@@ -3030,7 +3876,7 @@
     <w:p>
       <w:pPr>
         <w:rPr>
-          <w:rFonts w:eastAsiaTheme="minorHAnsi" w:hint="eastAsia"/>
+          <w:rFonts w:eastAsiaTheme="minorHAnsi"/>
           <w:szCs w:val="22"/>
         </w:rPr>
       </w:pPr>
@@ -3039,7 +3885,21 @@
           <w:rFonts w:eastAsiaTheme="minorHAnsi" w:hint="eastAsia"/>
           <w:szCs w:val="22"/>
         </w:rPr>
-        <w:t>또다른 수확은</w:t>
+        <w:t>또</w:t>
+      </w:r>
+      <w:r>
+        <w:rPr>
+          <w:rFonts w:eastAsiaTheme="minorHAnsi" w:hint="eastAsia"/>
+          <w:szCs w:val="22"/>
+        </w:rPr>
+        <w:t xml:space="preserve"> </w:t>
+      </w:r>
+      <w:r>
+        <w:rPr>
+          <w:rFonts w:eastAsiaTheme="minorHAnsi" w:hint="eastAsia"/>
+          <w:szCs w:val="22"/>
+        </w:rPr>
+        <w:t>다른 수확은</w:t>
       </w:r>
       <w:r>
         <w:rPr>
@@ -3488,7 +4348,7 @@
     <w:p>
       <w:pPr>
         <w:rPr>
-          <w:rFonts w:eastAsiaTheme="minorHAnsi" w:hint="eastAsia"/>
+          <w:rFonts w:eastAsiaTheme="minorHAnsi"/>
           <w:szCs w:val="22"/>
         </w:rPr>
       </w:pPr>
@@ -3496,7 +4356,7 @@
     <w:p>
       <w:pPr>
         <w:rPr>
-          <w:rFonts w:eastAsiaTheme="minorHAnsi"/>
+          <w:rFonts w:eastAsiaTheme="minorHAnsi" w:hint="eastAsia"/>
           <w:b/>
           <w:bCs/>
           <w:szCs w:val="22"/>
@@ -3507,9 +4367,64 @@
           <w:rFonts w:eastAsiaTheme="minorHAnsi" w:hint="eastAsia"/>
           <w:b/>
           <w:bCs/>
-          <w:szCs w:val="22"/>
-        </w:rPr>
-        <w:t>취업</w:t>
+          <w:noProof/>
+          <w:szCs w:val="22"/>
+        </w:rPr>
+        <w:drawing>
+          <wp:anchor distT="0" distB="0" distL="114300" distR="114300" simplePos="0" relativeHeight="251667456" behindDoc="0" locked="0" layoutInCell="1" allowOverlap="1" wp14:anchorId="373878B7" wp14:editId="6920D4DC">
+            <wp:simplePos x="0" y="0"/>
+            <wp:positionH relativeFrom="column">
+              <wp:posOffset>624205</wp:posOffset>
+            </wp:positionH>
+            <wp:positionV relativeFrom="paragraph">
+              <wp:posOffset>323850</wp:posOffset>
+            </wp:positionV>
+            <wp:extent cx="4254500" cy="3020060"/>
+            <wp:effectExtent l="0" t="0" r="0" b="2540"/>
+            <wp:wrapTopAndBottom/>
+            <wp:docPr id="674538665" name="그림 7"/>
+            <wp:cNvGraphicFramePr>
+              <a:graphicFrameLocks xmlns:a="http://schemas.openxmlformats.org/drawingml/2006/main" noChangeAspect="1"/>
+            </wp:cNvGraphicFramePr>
+            <a:graphic xmlns:a="http://schemas.openxmlformats.org/drawingml/2006/main">
+              <a:graphicData uri="http://schemas.openxmlformats.org/drawingml/2006/picture">
+                <pic:pic xmlns:pic="http://schemas.openxmlformats.org/drawingml/2006/picture">
+                  <pic:nvPicPr>
+                    <pic:cNvPr id="674538665" name="그림 674538665"/>
+                    <pic:cNvPicPr/>
+                  </pic:nvPicPr>
+                  <pic:blipFill>
+                    <a:blip r:embed="rId7" cstate="print">
+                      <a:extLst>
+                        <a:ext uri="{28A0092B-C50C-407E-A947-70E740481C1C}">
+                          <a14:useLocalDpi xmlns:a14="http://schemas.microsoft.com/office/drawing/2010/main" val="0"/>
+                        </a:ext>
+                      </a:extLst>
+                    </a:blip>
+                    <a:stretch>
+                      <a:fillRect/>
+                    </a:stretch>
+                  </pic:blipFill>
+                  <pic:spPr>
+                    <a:xfrm>
+                      <a:off x="0" y="0"/>
+                      <a:ext cx="4254500" cy="3020060"/>
+                    </a:xfrm>
+                    <a:prstGeom prst="rect">
+                      <a:avLst/>
+                    </a:prstGeom>
+                  </pic:spPr>
+                </pic:pic>
+              </a:graphicData>
+            </a:graphic>
+            <wp14:sizeRelH relativeFrom="margin">
+              <wp14:pctWidth>0</wp14:pctWidth>
+            </wp14:sizeRelH>
+            <wp14:sizeRelV relativeFrom="margin">
+              <wp14:pctHeight>0</wp14:pctHeight>
+            </wp14:sizeRelV>
+          </wp:anchor>
+        </w:drawing>
       </w:r>
       <w:r>
         <w:rPr>
@@ -3518,25 +4433,70 @@
           <w:bCs/>
           <w:szCs w:val="22"/>
         </w:rPr>
-        <w:t xml:space="preserve">난 때문이 아닌 </w:t>
-      </w:r>
-      <w:r>
-        <w:rPr>
-          <w:rFonts w:eastAsiaTheme="minorHAnsi"/>
+        <w:t>취업</w:t>
+      </w:r>
+      <w:r>
+        <w:rPr>
+          <w:rFonts w:eastAsiaTheme="minorHAnsi" w:hint="eastAsia"/>
           <w:b/>
           <w:bCs/>
           <w:szCs w:val="22"/>
         </w:rPr>
-        <w:t>‘</w:t>
-      </w:r>
-      <w:r>
-        <w:rPr>
-          <w:rFonts w:eastAsiaTheme="minorHAnsi" w:hint="eastAsia"/>
+        <w:t xml:space="preserve">난 때문이 아닌 </w:t>
+      </w:r>
+      <w:r>
+        <w:rPr>
+          <w:rFonts w:eastAsiaTheme="minorHAnsi"/>
           <w:b/>
           <w:bCs/>
           <w:szCs w:val="22"/>
         </w:rPr>
+        <w:t>‘</w:t>
+      </w:r>
+      <w:r>
+        <w:rPr>
+          <w:rFonts w:eastAsiaTheme="minorHAnsi" w:hint="eastAsia"/>
+          <w:b/>
+          <w:bCs/>
+          <w:szCs w:val="22"/>
+        </w:rPr>
         <w:t>문화 경험</w:t>
+      </w:r>
+      <w:r>
+        <w:rPr>
+          <w:rFonts w:eastAsiaTheme="minorHAnsi"/>
+          <w:b/>
+          <w:bCs/>
+          <w:szCs w:val="22"/>
+        </w:rPr>
+        <w:t>’</w:t>
+      </w:r>
+      <w:r>
+        <w:rPr>
+          <w:rFonts w:eastAsiaTheme="minorHAnsi" w:hint="eastAsia"/>
+          <w:b/>
+          <w:bCs/>
+          <w:szCs w:val="22"/>
+        </w:rPr>
+        <w:t xml:space="preserve">과 </w:t>
+      </w:r>
+      <w:r>
+        <w:rPr>
+          <w:rFonts w:eastAsiaTheme="minorHAnsi"/>
+          <w:b/>
+          <w:bCs/>
+          <w:szCs w:val="22"/>
+        </w:rPr>
+        <w:t>‘</w:t>
+      </w:r>
+      <w:r>
+        <w:rPr>
+          <w:rFonts w:eastAsiaTheme="minorHAnsi" w:hint="eastAsia"/>
+          <w:b/>
+          <w:bCs/>
+          <w:szCs w:val="22"/>
+        </w:rPr>
+        <w:t>성장</w:t>
       </w:r>
       <w:r>
         <w:rPr>
@@ -3574,7 +4534,28 @@
           <w:rFonts w:eastAsiaTheme="minorHAnsi" w:hint="eastAsia"/>
           <w:szCs w:val="22"/>
         </w:rPr>
-        <w:t xml:space="preserve">명도 </w:t>
+        <w:t>명</w:t>
+      </w:r>
+      <w:r>
+        <w:rPr>
+          <w:rFonts w:eastAsiaTheme="minorHAnsi" w:hint="eastAsia"/>
+          <w:szCs w:val="22"/>
+        </w:rPr>
+        <w:t xml:space="preserve"> 중 </w:t>
+      </w:r>
+      <w:r>
+        <w:rPr>
+          <w:rFonts w:eastAsiaTheme="minorHAnsi"/>
+          <w:szCs w:val="22"/>
+        </w:rPr>
+        <w:t>12</w:t>
+      </w:r>
+      <w:r>
+        <w:rPr>
+          <w:rFonts w:eastAsiaTheme="minorHAnsi" w:hint="eastAsia"/>
+          <w:szCs w:val="22"/>
+        </w:rPr>
+        <w:t xml:space="preserve">명은 </w:t>
       </w:r>
       <w:r>
         <w:rPr>
@@ -3915,6 +4896,7 @@
           <w:rFonts w:eastAsiaTheme="minorHAnsi"/>
           <w:szCs w:val="22"/>
         </w:rPr>
+        <w:lastRenderedPageBreak/>
         <w:t>“</w:t>
       </w:r>
       <w:r>
@@ -3971,7 +4953,7 @@
     <w:p>
       <w:pPr>
         <w:rPr>
-          <w:rFonts w:eastAsiaTheme="minorHAnsi" w:hint="eastAsia"/>
+          <w:rFonts w:eastAsiaTheme="minorHAnsi"/>
           <w:b/>
           <w:bCs/>
           <w:szCs w:val="22"/>
@@ -3984,7 +4966,25 @@
           <w:bCs/>
           <w:szCs w:val="22"/>
         </w:rPr>
-        <w:t xml:space="preserve">워홀은 </w:t>
+        <w:t>워홀</w:t>
+      </w:r>
+      <w:r>
+        <w:rPr>
+          <w:rFonts w:eastAsiaTheme="minorHAnsi" w:hint="eastAsia"/>
+          <w:b/>
+          <w:bCs/>
+          <w:szCs w:val="22"/>
+        </w:rPr>
+        <w:t>,</w:t>
+      </w:r>
+      <w:r>
+        <w:rPr>
+          <w:rFonts w:eastAsiaTheme="minorHAnsi" w:hint="eastAsia"/>
+          <w:b/>
+          <w:bCs/>
+          <w:szCs w:val="22"/>
+        </w:rPr>
+        <w:t xml:space="preserve"> </w:t>
       </w:r>
       <w:r>
         <w:rPr>
@@ -4008,121 +5008,140 @@
           <w:rFonts w:eastAsiaTheme="minorHAnsi" w:hint="eastAsia"/>
           <w:szCs w:val="22"/>
         </w:rPr>
-        <w:t>워</w:t>
-      </w:r>
-      <w:r>
-        <w:rPr>
-          <w:rFonts w:eastAsiaTheme="minorHAnsi" w:hint="eastAsia"/>
-          <w:szCs w:val="22"/>
-        </w:rPr>
-        <w:t>홀은</w:t>
-      </w:r>
-      <w:r>
-        <w:rPr>
-          <w:rFonts w:eastAsiaTheme="minorHAnsi" w:hint="eastAsia"/>
-          <w:szCs w:val="22"/>
-        </w:rPr>
-        <w:t xml:space="preserve"> 분명 완벽한 선택이 아니다.</w:t>
-      </w:r>
-      <w:r>
-        <w:rPr>
-          <w:rFonts w:eastAsiaTheme="minorHAnsi"/>
-          <w:szCs w:val="22"/>
-        </w:rPr>
-        <w:t xml:space="preserve"> </w:t>
-      </w:r>
-      <w:r>
-        <w:rPr>
-          <w:rFonts w:eastAsiaTheme="minorHAnsi" w:hint="eastAsia"/>
-          <w:szCs w:val="22"/>
-        </w:rPr>
-        <w:t xml:space="preserve">초기 정착 비용만 </w:t>
-      </w:r>
-      <w:proofErr w:type="spellStart"/>
-      <w:r>
-        <w:rPr>
-          <w:rFonts w:eastAsiaTheme="minorHAnsi" w:hint="eastAsia"/>
-          <w:szCs w:val="22"/>
-        </w:rPr>
-        <w:t>수백에서</w:t>
-      </w:r>
-      <w:proofErr w:type="spellEnd"/>
-      <w:r>
-        <w:rPr>
-          <w:rFonts w:eastAsiaTheme="minorHAnsi" w:hint="eastAsia"/>
-          <w:szCs w:val="22"/>
-        </w:rPr>
-        <w:t xml:space="preserve"> 수천만 원이 들고,</w:t>
-      </w:r>
-      <w:r>
-        <w:rPr>
-          <w:rFonts w:eastAsiaTheme="minorHAnsi"/>
-          <w:szCs w:val="22"/>
-        </w:rPr>
-        <w:t xml:space="preserve"> </w:t>
-      </w:r>
-      <w:r>
-        <w:rPr>
-          <w:rFonts w:eastAsiaTheme="minorHAnsi" w:hint="eastAsia"/>
-          <w:szCs w:val="22"/>
-        </w:rPr>
-        <w:t>낯선 언어와 문화 속에서 홀로 버텨야 하는 날도 있다.</w:t>
-      </w:r>
-      <w:r>
-        <w:rPr>
-          <w:rFonts w:eastAsiaTheme="minorHAnsi"/>
-          <w:szCs w:val="22"/>
-        </w:rPr>
-        <w:t xml:space="preserve"> </w:t>
-      </w:r>
-      <w:r>
-        <w:rPr>
-          <w:rFonts w:eastAsiaTheme="minorHAnsi" w:hint="eastAsia"/>
-          <w:szCs w:val="22"/>
-        </w:rPr>
-        <w:t>그럼에도 이들이 해외로 향하는 이유는 한국이 싫어서,</w:t>
-      </w:r>
-      <w:r>
-        <w:rPr>
-          <w:rFonts w:eastAsiaTheme="minorHAnsi"/>
-          <w:szCs w:val="22"/>
-        </w:rPr>
-        <w:t xml:space="preserve"> </w:t>
-      </w:r>
-      <w:r>
-        <w:rPr>
-          <w:rFonts w:eastAsiaTheme="minorHAnsi" w:hint="eastAsia"/>
-          <w:szCs w:val="22"/>
-        </w:rPr>
-        <w:t>현실을 피해서도 아니</w:t>
-      </w:r>
-      <w:r>
-        <w:rPr>
-          <w:rFonts w:eastAsiaTheme="minorHAnsi" w:hint="eastAsia"/>
-          <w:szCs w:val="22"/>
-        </w:rPr>
-        <w:t>었</w:t>
-      </w:r>
-      <w:r>
-        <w:rPr>
-          <w:rFonts w:eastAsiaTheme="minorHAnsi" w:hint="eastAsia"/>
-          <w:szCs w:val="22"/>
-        </w:rPr>
-        <w:t>다.</w:t>
-      </w:r>
-      <w:r>
-        <w:rPr>
-          <w:rFonts w:eastAsiaTheme="minorHAnsi" w:hint="eastAsia"/>
-          <w:szCs w:val="22"/>
-        </w:rPr>
-        <w:t xml:space="preserve"> 더 넓은 곳에서 스스</w:t>
-      </w:r>
-      <w:r>
-        <w:rPr>
-          <w:rFonts w:eastAsiaTheme="minorHAnsi" w:hint="eastAsia"/>
-          <w:szCs w:val="22"/>
-        </w:rPr>
-        <w:t>로에게 질문을 던지고 싶어서다.</w:t>
+        <w:t>청년들이 해외</w:t>
+      </w:r>
+      <w:r>
+        <w:rPr>
+          <w:rFonts w:eastAsiaTheme="minorHAnsi" w:hint="eastAsia"/>
+          <w:szCs w:val="22"/>
+        </w:rPr>
+        <w:t>로 향한</w:t>
+      </w:r>
+      <w:r>
+        <w:rPr>
+          <w:rFonts w:eastAsiaTheme="minorHAnsi" w:hint="eastAsia"/>
+          <w:szCs w:val="22"/>
+        </w:rPr>
+        <w:t xml:space="preserve"> 이유</w:t>
+      </w:r>
+      <w:r>
+        <w:rPr>
+          <w:rFonts w:eastAsiaTheme="minorHAnsi" w:hint="eastAsia"/>
+          <w:szCs w:val="22"/>
+        </w:rPr>
+        <w:t>를</w:t>
+      </w:r>
+      <w:r>
+        <w:rPr>
+          <w:rFonts w:eastAsiaTheme="minorHAnsi" w:hint="eastAsia"/>
+          <w:szCs w:val="22"/>
+        </w:rPr>
+        <w:t xml:space="preserve"> </w:t>
+      </w:r>
+      <w:r>
+        <w:rPr>
+          <w:rFonts w:eastAsiaTheme="minorHAnsi" w:hint="eastAsia"/>
+          <w:szCs w:val="22"/>
+        </w:rPr>
+        <w:t xml:space="preserve">그저 </w:t>
+      </w:r>
+      <w:r>
+        <w:rPr>
+          <w:rFonts w:eastAsiaTheme="minorHAnsi" w:hint="eastAsia"/>
+          <w:szCs w:val="22"/>
+        </w:rPr>
+        <w:t>취업난으로</w:t>
+      </w:r>
+      <w:r>
+        <w:rPr>
+          <w:rFonts w:eastAsiaTheme="minorHAnsi" w:hint="eastAsia"/>
+          <w:szCs w:val="22"/>
+        </w:rPr>
+        <w:t>,</w:t>
+      </w:r>
+      <w:r>
+        <w:rPr>
+          <w:rFonts w:eastAsiaTheme="minorHAnsi"/>
+          <w:szCs w:val="22"/>
+        </w:rPr>
+        <w:t xml:space="preserve"> </w:t>
+      </w:r>
+      <w:r>
+        <w:rPr>
+          <w:rFonts w:eastAsiaTheme="minorHAnsi" w:hint="eastAsia"/>
+          <w:szCs w:val="22"/>
+        </w:rPr>
+        <w:t>혹은 현실 도피로 단순화하기 어렵다.</w:t>
+      </w:r>
+      <w:r>
+        <w:rPr>
+          <w:rFonts w:eastAsiaTheme="minorHAnsi"/>
+          <w:szCs w:val="22"/>
+        </w:rPr>
+        <w:t xml:space="preserve"> </w:t>
+      </w:r>
+      <w:r>
+        <w:rPr>
+          <w:rFonts w:eastAsiaTheme="minorHAnsi" w:hint="eastAsia"/>
+          <w:szCs w:val="22"/>
+        </w:rPr>
+        <w:t xml:space="preserve">그들의 </w:t>
+      </w:r>
+      <w:r>
+        <w:rPr>
+          <w:rFonts w:eastAsiaTheme="minorHAnsi" w:hint="eastAsia"/>
+          <w:szCs w:val="22"/>
+        </w:rPr>
+        <w:t xml:space="preserve">공통된 </w:t>
+      </w:r>
+      <w:r>
+        <w:rPr>
+          <w:rFonts w:eastAsiaTheme="minorHAnsi" w:hint="eastAsia"/>
+          <w:szCs w:val="22"/>
+        </w:rPr>
+        <w:t>목적</w:t>
+      </w:r>
+      <w:r>
+        <w:rPr>
+          <w:rFonts w:eastAsiaTheme="minorHAnsi" w:hint="eastAsia"/>
+          <w:szCs w:val="22"/>
+        </w:rPr>
+        <w:t>은</w:t>
+      </w:r>
+      <w:r>
+        <w:rPr>
+          <w:rFonts w:eastAsiaTheme="minorHAnsi" w:hint="eastAsia"/>
+          <w:szCs w:val="22"/>
+        </w:rPr>
+        <w:t xml:space="preserve"> </w:t>
+      </w:r>
+      <w:r>
+        <w:rPr>
+          <w:rFonts w:eastAsiaTheme="minorHAnsi"/>
+          <w:szCs w:val="22"/>
+        </w:rPr>
+        <w:t>‘</w:t>
+      </w:r>
+      <w:r>
+        <w:rPr>
+          <w:rFonts w:eastAsiaTheme="minorHAnsi" w:hint="eastAsia"/>
+          <w:szCs w:val="22"/>
+        </w:rPr>
+        <w:t>나 자신</w:t>
+      </w:r>
+      <w:r>
+        <w:rPr>
+          <w:rFonts w:eastAsiaTheme="minorHAnsi"/>
+          <w:szCs w:val="22"/>
+        </w:rPr>
+        <w:t>’</w:t>
+      </w:r>
+      <w:r>
+        <w:rPr>
+          <w:rFonts w:eastAsiaTheme="minorHAnsi" w:hint="eastAsia"/>
+          <w:szCs w:val="22"/>
+        </w:rPr>
+        <w:t>을 아는 것이었다.</w:t>
       </w:r>
     </w:p>
     <w:p>
@@ -4180,76 +5199,91 @@
           <w:rFonts w:eastAsiaTheme="minorHAnsi" w:hint="eastAsia"/>
           <w:szCs w:val="22"/>
         </w:rPr>
-        <w:t>그 질문에 대한 답을,</w:t>
-      </w:r>
-      <w:r>
-        <w:rPr>
-          <w:rFonts w:eastAsiaTheme="minorHAnsi"/>
-          <w:szCs w:val="22"/>
-        </w:rPr>
-        <w:t xml:space="preserve"> </w:t>
-      </w:r>
-      <w:r>
-        <w:rPr>
-          <w:rFonts w:eastAsiaTheme="minorHAnsi" w:hint="eastAsia"/>
-          <w:szCs w:val="22"/>
-        </w:rPr>
-        <w:t>이들은 해외의 평범한 일상 속에서 찾고 있었다.</w:t>
-      </w:r>
-    </w:p>
-    <w:p>
-      <w:pPr>
-        <w:rPr>
-          <w:rFonts w:eastAsiaTheme="minorHAnsi"/>
-          <w:szCs w:val="22"/>
-        </w:rPr>
-      </w:pPr>
-    </w:p>
-    <w:p>
-      <w:pPr>
-        <w:rPr>
-          <w:rFonts w:eastAsiaTheme="minorHAnsi"/>
-          <w:szCs w:val="22"/>
-        </w:rPr>
-      </w:pPr>
-      <w:r>
-        <w:rPr>
-          <w:rFonts w:ascii="Apple Color Emoji" w:eastAsiaTheme="minorHAnsi" w:hAnsi="Apple Color Emoji" w:cs="Apple Color Emoji"/>
-          <w:szCs w:val="22"/>
-        </w:rPr>
-        <w:t>📌</w:t>
-      </w:r>
-      <w:r>
-        <w:rPr>
-          <w:rFonts w:eastAsiaTheme="minorHAnsi"/>
-          <w:szCs w:val="22"/>
-        </w:rPr>
-        <w:t xml:space="preserve"> </w:t>
-      </w:r>
-      <w:proofErr w:type="spellStart"/>
-      <w:r>
-        <w:rPr>
-          <w:rStyle w:val="aa"/>
-          <w:rFonts w:eastAsiaTheme="minorHAnsi"/>
-          <w:szCs w:val="22"/>
-        </w:rPr>
-        <w:t>워킹홀리데이</w:t>
-      </w:r>
-      <w:proofErr w:type="spellEnd"/>
-      <w:r>
-        <w:rPr>
-          <w:rStyle w:val="aa"/>
-          <w:rFonts w:eastAsiaTheme="minorHAnsi"/>
-          <w:szCs w:val="22"/>
-        </w:rPr>
-        <w:t>(Working Holiday)란?</w:t>
-      </w:r>
-      <w:r>
-        <w:rPr>
-          <w:rFonts w:eastAsiaTheme="minorHAnsi"/>
-          <w:szCs w:val="22"/>
-        </w:rPr>
-        <w:t xml:space="preserve"> 만 18~30세 청년이 협정 체결 국가에서 최대 1년간 관광, 취업, 어학연수 등을 병행할 수 있도록 마련된 제도. 2024년 기준 국내 발급 비자 수는 3만 8,590건으로, 2022년 대비 두 배 가까이 증가했다.</w:t>
+        <w:t>그 질문에 대한 답</w:t>
+      </w:r>
+      <w:r>
+        <w:rPr>
+          <w:rFonts w:eastAsiaTheme="minorHAnsi" w:hint="eastAsia"/>
+          <w:szCs w:val="22"/>
+        </w:rPr>
+        <w:t>을</w:t>
+      </w:r>
+      <w:r>
+        <w:rPr>
+          <w:rFonts w:eastAsiaTheme="minorHAnsi" w:hint="eastAsia"/>
+          <w:szCs w:val="22"/>
+        </w:rPr>
+        <w:t>,</w:t>
+      </w:r>
+      <w:r>
+        <w:rPr>
+          <w:rFonts w:eastAsiaTheme="minorHAnsi"/>
+          <w:szCs w:val="22"/>
+        </w:rPr>
+        <w:t xml:space="preserve"> </w:t>
+      </w:r>
+      <w:r>
+        <w:rPr>
+          <w:rFonts w:eastAsiaTheme="minorHAnsi" w:hint="eastAsia"/>
+          <w:szCs w:val="22"/>
+        </w:rPr>
+        <w:t xml:space="preserve">이들은 </w:t>
+      </w:r>
+      <w:r>
+        <w:rPr>
+          <w:rFonts w:eastAsiaTheme="minorHAnsi" w:hint="eastAsia"/>
+          <w:szCs w:val="22"/>
+        </w:rPr>
+        <w:t>타국의 낯설고도 평범한</w:t>
+      </w:r>
+      <w:r>
+        <w:rPr>
+          <w:rFonts w:eastAsiaTheme="minorHAnsi" w:hint="eastAsia"/>
+          <w:szCs w:val="22"/>
+        </w:rPr>
+        <w:t xml:space="preserve"> 일상에서 찾고 있었다.</w:t>
+      </w:r>
+      <w:r>
+        <w:rPr>
+          <w:rFonts w:eastAsiaTheme="minorHAnsi"/>
+          <w:szCs w:val="22"/>
+        </w:rPr>
+        <w:t xml:space="preserve"> </w:t>
+      </w:r>
+      <w:r>
+        <w:rPr>
+          <w:rFonts w:eastAsiaTheme="minorHAnsi" w:hint="eastAsia"/>
+          <w:szCs w:val="22"/>
+        </w:rPr>
+        <w:t>이들에게 워홀이란 단순한 스펙 한 줄보다</w:t>
+      </w:r>
+      <w:r>
+        <w:rPr>
+          <w:rFonts w:eastAsiaTheme="minorHAnsi"/>
+          <w:szCs w:val="22"/>
+        </w:rPr>
+        <w:t xml:space="preserve"> </w:t>
+      </w:r>
+      <w:r>
+        <w:rPr>
+          <w:rFonts w:eastAsiaTheme="minorHAnsi" w:hint="eastAsia"/>
+          <w:szCs w:val="22"/>
+        </w:rPr>
+        <w:t>자신을</w:t>
+      </w:r>
+      <w:r>
+        <w:rPr>
+          <w:rFonts w:eastAsiaTheme="minorHAnsi" w:hint="eastAsia"/>
+          <w:szCs w:val="22"/>
+        </w:rPr>
+        <w:t xml:space="preserve"> 발견하고 성장시키는 시간이었다.</w:t>
+      </w:r>
+      <w:r>
+        <w:rPr>
+          <w:rFonts w:eastAsiaTheme="minorHAnsi"/>
+          <w:szCs w:val="22"/>
+        </w:rPr>
+        <w:t xml:space="preserve"> </w:t>
       </w:r>
     </w:p>
     <w:sectPr>
@@ -5214,6 +6248,76 @@
     <w:basedOn w:val="a0"/>
     <w:rsid w:val="009B1A19"/>
   </w:style>
+  <w:style w:type="character" w:styleId="ac">
+    <w:name w:val="annotation reference"/>
+    <w:basedOn w:val="a0"/>
+    <w:uiPriority w:val="99"/>
+    <w:semiHidden/>
+    <w:unhideWhenUsed/>
+    <w:rsid w:val="00EB2B69"/>
+    <w:rPr>
+      <w:sz w:val="18"/>
+      <w:szCs w:val="18"/>
+    </w:rPr>
+  </w:style>
+  <w:style w:type="paragraph" w:styleId="ad">
+    <w:name w:val="annotation text"/>
+    <w:basedOn w:val="a"/>
+    <w:link w:val="Char3"/>
+    <w:uiPriority w:val="99"/>
+    <w:semiHidden/>
+    <w:unhideWhenUsed/>
+    <w:rsid w:val="00EB2B69"/>
+  </w:style>
+  <w:style w:type="character" w:customStyle="1" w:styleId="Char3">
+    <w:name w:val="메모 텍스트 Char"/>
+    <w:basedOn w:val="a0"/>
+    <w:link w:val="ad"/>
+    <w:uiPriority w:val="99"/>
+    <w:semiHidden/>
+    <w:rsid w:val="00EB2B69"/>
+  </w:style>
+  <w:style w:type="paragraph" w:styleId="ae">
+    <w:name w:val="annotation subject"/>
+    <w:basedOn w:val="ad"/>
+    <w:next w:val="ad"/>
+    <w:link w:val="Char4"/>
+    <w:uiPriority w:val="99"/>
+    <w:semiHidden/>
+    <w:unhideWhenUsed/>
+    <w:rsid w:val="00EB2B69"/>
+    <w:rPr>
+      <w:b/>
+      <w:bCs/>
+    </w:rPr>
+  </w:style>
+  <w:style w:type="character" w:customStyle="1" w:styleId="Char4">
+    <w:name w:val="메모 주제 Char"/>
+    <w:basedOn w:val="Char3"/>
+    <w:link w:val="ae"/>
+    <w:uiPriority w:val="99"/>
+    <w:semiHidden/>
+    <w:rsid w:val="00EB2B69"/>
+    <w:rPr>
+      <w:b/>
+      <w:bCs/>
+    </w:rPr>
+  </w:style>
+  <w:style w:type="paragraph" w:styleId="af">
+    <w:name w:val="caption"/>
+    <w:basedOn w:val="a"/>
+    <w:next w:val="a"/>
+    <w:uiPriority w:val="35"/>
+    <w:unhideWhenUsed/>
+    <w:qFormat/>
+    <w:rsid w:val="008610B9"/>
+    <w:rPr>
+      <w:b/>
+      <w:bCs/>
+      <w:sz w:val="20"/>
+      <w:szCs w:val="20"/>
+    </w:rPr>
+  </w:style>
 </w:styles>
 </file>
 

</xml_diff>